<commit_message>
Adım 2 - Ağır sorgu test edildi ve Execution Plan ile performans açığı raporlandı
</commit_message>
<xml_diff>
--- a/BLM4522_Proje1/Proje1_Rapor.docx
+++ b/BLM4522_Proje1/Proje1_Rapor.docx
@@ -163,27 +163,7 @@
           <w:sz w:val="28"/>
           <w:szCs w:val="28"/>
         </w:rPr>
-        <w:t xml:space="preserve">BLM 4522 – Proje </w:t>
-      </w:r>
-      <w:r>
-        <w:rPr>
-          <w:rFonts w:cs="Arial"/>
-          <w:b/>
-          <w:bCs/>
-          <w:sz w:val="28"/>
-          <w:szCs w:val="28"/>
-        </w:rPr>
-        <w:t>1</w:t>
-      </w:r>
-      <w:r>
-        <w:rPr>
-          <w:rFonts w:cs="Arial"/>
-          <w:b/>
-          <w:bCs/>
-          <w:sz w:val="28"/>
-          <w:szCs w:val="28"/>
-        </w:rPr>
-        <w:t xml:space="preserve">: </w:t>
+        <w:t xml:space="preserve">BLM 4522 – Proje 1: </w:t>
       </w:r>
       <w:proofErr w:type="spellStart"/>
       <w:r>
@@ -1653,6 +1633,9 @@
     </w:p>
     <w:p>
       <w:r>
+        <w:rPr>
+          <w:noProof/>
+        </w:rPr>
         <w:drawing>
           <wp:inline distT="0" distB="0" distL="0" distR="0" wp14:anchorId="4B0B998A" wp14:editId="170E16FB">
             <wp:extent cx="1661304" cy="1874682"/>
@@ -1696,9 +1679,239 @@
     <w:p/>
     <w:p/>
     <w:p/>
+    <w:p>
+      <w:r>
+        <w:lastRenderedPageBreak/>
+        <w:t>01.06</w:t>
+      </w:r>
+      <w:r>
+        <w:t>.2026</w:t>
+      </w:r>
+    </w:p>
+    <w:p>
+      <w:pPr>
+        <w:pStyle w:val="Balk2"/>
+      </w:pPr>
+      <w:r>
+        <w:t xml:space="preserve">ADIM </w:t>
+      </w:r>
+      <w:r>
+        <w:t>2</w:t>
+      </w:r>
+      <w:r>
+        <w:t xml:space="preserve">: </w:t>
+      </w:r>
+      <w:r>
+        <w:t>Darboğaz Analizi ve Ağır Sorgu Senaryosu</w:t>
+      </w:r>
+    </w:p>
+    <w:p>
+      <w:proofErr w:type="spellStart"/>
+      <w:r>
+        <w:t>Veritabanı</w:t>
+      </w:r>
+      <w:proofErr w:type="spellEnd"/>
+      <w:r>
+        <w:t xml:space="preserve"> optimizasyon süreçlerinin ilk aşaması olarak , sistemdeki eksik indeksleri ve performans kayıplarını tespit etmek amacıyla </w:t>
+      </w:r>
+      <w:proofErr w:type="spellStart"/>
+      <w:r>
+        <w:t>Sales.SalesOrderDetail</w:t>
+      </w:r>
+      <w:proofErr w:type="spellEnd"/>
+      <w:r>
+        <w:t xml:space="preserve"> tablosu hedef alınmıştır. Üzerinde herhangi bir indeks bulunmayan </w:t>
+      </w:r>
+      <w:proofErr w:type="spellStart"/>
+      <w:r>
+        <w:t>LineTotal</w:t>
+      </w:r>
+      <w:proofErr w:type="spellEnd"/>
+      <w:r>
+        <w:t xml:space="preserve"> ve </w:t>
+      </w:r>
+      <w:proofErr w:type="spellStart"/>
+      <w:r>
+        <w:t>ModifiedDate</w:t>
+      </w:r>
+      <w:proofErr w:type="spellEnd"/>
+      <w:r>
+        <w:t xml:space="preserve"> kolonları filtrelenerek ağır bir sorgu test edilmiştir. </w:t>
+      </w:r>
+    </w:p>
+    <w:p>
+      <w:r>
+        <w:t xml:space="preserve">Analiz Bulguları: SSMS </w:t>
+      </w:r>
+      <w:proofErr w:type="spellStart"/>
+      <w:r>
+        <w:rPr>
+          <w:i/>
+          <w:iCs/>
+        </w:rPr>
+        <w:t>Actual</w:t>
+      </w:r>
+      <w:proofErr w:type="spellEnd"/>
+      <w:r>
+        <w:rPr>
+          <w:i/>
+          <w:iCs/>
+        </w:rPr>
+        <w:t xml:space="preserve"> </w:t>
+      </w:r>
+      <w:proofErr w:type="spellStart"/>
+      <w:r>
+        <w:rPr>
+          <w:i/>
+          <w:iCs/>
+        </w:rPr>
+        <w:t>Execution</w:t>
+      </w:r>
+      <w:proofErr w:type="spellEnd"/>
+      <w:r>
+        <w:rPr>
+          <w:i/>
+          <w:iCs/>
+        </w:rPr>
+        <w:t xml:space="preserve"> Plan</w:t>
+      </w:r>
+      <w:r>
+        <w:t xml:space="preserve"> aracıyla yapılan incelemede, SQL Server motorunun veriye doğrudan erişemediği ve tüm tabloyu satır </w:t>
+      </w:r>
+      <w:proofErr w:type="spellStart"/>
+      <w:r>
+        <w:t>satır</w:t>
+      </w:r>
+      <w:proofErr w:type="spellEnd"/>
+      <w:r>
+        <w:t xml:space="preserve"> tarayarak </w:t>
+      </w:r>
+      <w:proofErr w:type="spellStart"/>
+      <w:r>
+        <w:t>Clustered</w:t>
+      </w:r>
+      <w:proofErr w:type="spellEnd"/>
+      <w:r>
+        <w:t xml:space="preserve"> Index </w:t>
+      </w:r>
+      <w:proofErr w:type="spellStart"/>
+      <w:r>
+        <w:t>Scan</w:t>
+      </w:r>
+      <w:proofErr w:type="spellEnd"/>
+      <w:r>
+        <w:t xml:space="preserve"> yaptığı gözlemlenmiştir.  Query </w:t>
+      </w:r>
+      <w:proofErr w:type="spellStart"/>
+      <w:r>
+        <w:t>Optimizer</w:t>
+      </w:r>
+      <w:proofErr w:type="spellEnd"/>
+      <w:r>
+        <w:t xml:space="preserve"> (Sorgu Optimize Edici), ekranın üst kısmında yeşil renkli bir </w:t>
+      </w:r>
+      <w:proofErr w:type="spellStart"/>
+      <w:r>
+        <w:t>Missing</w:t>
+      </w:r>
+      <w:proofErr w:type="spellEnd"/>
+      <w:r>
+        <w:t xml:space="preserve"> Index (Eksik İndeks) uyarısı üreterek sistemde ciddi bir indeks açığı olduğunu doğrulamıştır.</w:t>
+      </w:r>
+    </w:p>
     <w:p/>
-    <w:p/>
-    <w:p/>
+    <w:p>
+      <w:r>
+        <w:drawing>
+          <wp:inline distT="0" distB="0" distL="0" distR="0" wp14:anchorId="3259E5AC" wp14:editId="17CB8B66">
+            <wp:extent cx="5829300" cy="1630680"/>
+            <wp:effectExtent l="0" t="0" r="0" b="7620"/>
+            <wp:docPr id="106820382" name="Resim 1" descr="metin, ekran görüntüsü, çizgi, yazı tipi içeren bir resim&#10;&#10;Yapay zeka tarafından oluşturulmuş içerik yanlış olabilir."/>
+            <wp:cNvGraphicFramePr>
+              <a:graphicFrameLocks xmlns:a="http://schemas.openxmlformats.org/drawingml/2006/main" noChangeAspect="1"/>
+            </wp:cNvGraphicFramePr>
+            <a:graphic xmlns:a="http://schemas.openxmlformats.org/drawingml/2006/main">
+              <a:graphicData uri="http://schemas.openxmlformats.org/drawingml/2006/picture">
+                <pic:pic xmlns:pic="http://schemas.openxmlformats.org/drawingml/2006/picture">
+                  <pic:nvPicPr>
+                    <pic:cNvPr id="106820382" name="Resim 1" descr="metin, ekran görüntüsü, çizgi, yazı tipi içeren bir resim&#10;&#10;Yapay zeka tarafından oluşturulmuş içerik yanlış olabilir."/>
+                    <pic:cNvPicPr/>
+                  </pic:nvPicPr>
+                  <pic:blipFill>
+                    <a:blip r:embed="rId7"/>
+                    <a:stretch>
+                      <a:fillRect/>
+                    </a:stretch>
+                  </pic:blipFill>
+                  <pic:spPr>
+                    <a:xfrm>
+                      <a:off x="0" y="0"/>
+                      <a:ext cx="5829300" cy="1630680"/>
+                    </a:xfrm>
+                    <a:prstGeom prst="rect">
+                      <a:avLst/>
+                    </a:prstGeom>
+                  </pic:spPr>
+                </pic:pic>
+              </a:graphicData>
+            </a:graphic>
+          </wp:inline>
+        </w:drawing>
+      </w:r>
+    </w:p>
+    <w:p>
+      <w:r>
+        <w:t xml:space="preserve">Yürütme planı analizi incelendiğinde, </w:t>
+      </w:r>
+      <w:proofErr w:type="spellStart"/>
+      <w:r>
+        <w:t>veritabanı</w:t>
+      </w:r>
+      <w:proofErr w:type="spellEnd"/>
+      <w:r>
+        <w:t xml:space="preserve"> motorunun hedef verilere doğrudan erişemediği ve bu nedenle tüm tabloyu satır </w:t>
+      </w:r>
+      <w:proofErr w:type="spellStart"/>
+      <w:r>
+        <w:t>satır</w:t>
+      </w:r>
+      <w:proofErr w:type="spellEnd"/>
+      <w:r>
+        <w:t xml:space="preserve"> taramak (</w:t>
+      </w:r>
+      <w:proofErr w:type="spellStart"/>
+      <w:r>
+        <w:t>Clustered</w:t>
+      </w:r>
+      <w:proofErr w:type="spellEnd"/>
+      <w:r>
+        <w:t xml:space="preserve"> Index </w:t>
+      </w:r>
+      <w:proofErr w:type="spellStart"/>
+      <w:r>
+        <w:t>Scan</w:t>
+      </w:r>
+      <w:proofErr w:type="spellEnd"/>
+      <w:r>
+        <w:t xml:space="preserve">) zorunda kaldığı görülmektedir. Küçük bir hedef kütleye ulaşabilmek adına tablodaki tüm satırların diskten okunması, sistem üzerinde ciddi bir performans darboğazına yol açmıştır. SQL Server’ın akıllı sorgu optimize edicisi (Query </w:t>
+      </w:r>
+      <w:proofErr w:type="spellStart"/>
+      <w:r>
+        <w:t>Optimizer</w:t>
+      </w:r>
+      <w:proofErr w:type="spellEnd"/>
+      <w:r>
+        <w:t>) bu verimsizliği anlık olarak yakalamış ve sisteme dahil edildiğinde sorgu hızını yaklaşık yarı yarıya artıracak stratejik bir eksik dizin (</w:t>
+      </w:r>
+      <w:proofErr w:type="spellStart"/>
+      <w:r>
+        <w:t>Missing</w:t>
+      </w:r>
+      <w:proofErr w:type="spellEnd"/>
+      <w:r>
+        <w:t xml:space="preserve"> Index) önerisinde bulunmuştur.</w:t>
+      </w:r>
+    </w:p>
     <w:p/>
     <w:p/>
     <w:p/>

</xml_diff>

<commit_message>
Proje 1: Eksik indeks oluşturuldu ve performans artışı rapora eklendi
</commit_message>
<xml_diff>
--- a/BLM4522_Proje1/Proje1_Rapor.docx
+++ b/BLM4522_Proje1/Proje1_Rapor.docx
@@ -263,7 +263,6 @@
           <w:szCs w:val="28"/>
         </w:rPr>
       </w:pPr>
-      <w:bookmarkStart w:id="0" w:name="_Toc227625951"/>
       <w:r>
         <w:rPr>
           <w:b/>
@@ -333,7 +332,6 @@
         </w:rPr>
         <w:t>-Sistemleri-Projeleri</w:t>
       </w:r>
-      <w:bookmarkEnd w:id="0"/>
     </w:p>
     <w:p>
       <w:pPr>
@@ -402,14 +400,14 @@
           <w:r>
             <w:fldChar w:fldCharType="separate"/>
           </w:r>
-          <w:hyperlink w:anchor="_Toc227625951" w:history="1">
+          <w:hyperlink w:anchor="_Toc231228142" w:history="1">
             <w:r>
               <w:rPr>
                 <w:rStyle w:val="Kpr"/>
-                <w:rFonts w:eastAsiaTheme="minorHAnsi"/>
+                <w:bCs/>
                 <w:noProof/>
               </w:rPr>
-              <w:t>https://github.com/senemarici/BLM4522--Ag-Tabanli-Paralel-Dagitim-Sistemleri-Projeleri</w:t>
+              <w:t>Proje 1: Veritabanı Performans Optimizasyonu ve İzleme</w:t>
             </w:r>
             <w:r>
               <w:rPr>
@@ -430,7 +428,7 @@
                 <w:noProof/>
                 <w:webHidden/>
               </w:rPr>
-              <w:instrText xml:space="preserve"> PAGEREF _Toc227625951 \h </w:instrText>
+              <w:instrText xml:space="preserve"> PAGEREF _Toc231228142 \h </w:instrText>
             </w:r>
             <w:r>
               <w:rPr>
@@ -450,7 +448,7 @@
                 <w:noProof/>
                 <w:webHidden/>
               </w:rPr>
-              <w:t>1</w:t>
+              <w:t>2</w:t>
             </w:r>
             <w:r>
               <w:rPr>
@@ -463,28 +461,24 @@
         </w:p>
         <w:p>
           <w:pPr>
-            <w:pStyle w:val="T1"/>
-            <w:tabs>
-              <w:tab w:val="right" w:leader="dot" w:pos="9062"/>
-            </w:tabs>
+            <w:pStyle w:val="T2"/>
             <w:rPr>
               <w:rFonts w:asciiTheme="minorHAnsi" w:eastAsiaTheme="minorEastAsia" w:hAnsiTheme="minorHAnsi" w:cstheme="minorBidi"/>
               <w:b w:val="0"/>
               <w:noProof/>
               <w:kern w:val="2"/>
-              <w:szCs w:val="24"/>
-              <w:lang w:val="tr-TR" w:eastAsia="tr-TR"/>
+              <w:u w:val="none"/>
+              <w:lang w:eastAsia="tr-TR"/>
               <w14:ligatures w14:val="standardContextual"/>
             </w:rPr>
           </w:pPr>
-          <w:hyperlink w:anchor="_Toc227625952" w:history="1">
+          <w:hyperlink w:anchor="_Toc231228143" w:history="1">
             <w:r>
               <w:rPr>
                 <w:rStyle w:val="Kpr"/>
-                <w:bCs/>
                 <w:noProof/>
               </w:rPr>
-              <w:t>Proje 2: Yedekleme ve Felaketten Kurtarma</w:t>
+              <w:t>ADIM 1: Veritabanı Altyapısının Kurulması ve Hazırlık Süreci</w:t>
             </w:r>
             <w:r>
               <w:rPr>
@@ -505,7 +499,78 @@
                 <w:noProof/>
                 <w:webHidden/>
               </w:rPr>
-              <w:instrText xml:space="preserve"> PAGEREF _Toc227625952 \h </w:instrText>
+              <w:instrText xml:space="preserve"> PAGEREF _Toc231228143 \h </w:instrText>
+            </w:r>
+            <w:r>
+              <w:rPr>
+                <w:noProof/>
+                <w:webHidden/>
+              </w:rPr>
+            </w:r>
+            <w:r>
+              <w:rPr>
+                <w:noProof/>
+                <w:webHidden/>
+              </w:rPr>
+              <w:fldChar w:fldCharType="separate"/>
+            </w:r>
+            <w:r>
+              <w:rPr>
+                <w:noProof/>
+                <w:webHidden/>
+              </w:rPr>
+              <w:t>2</w:t>
+            </w:r>
+            <w:r>
+              <w:rPr>
+                <w:noProof/>
+                <w:webHidden/>
+              </w:rPr>
+              <w:fldChar w:fldCharType="end"/>
+            </w:r>
+          </w:hyperlink>
+        </w:p>
+        <w:p>
+          <w:pPr>
+            <w:pStyle w:val="T2"/>
+            <w:rPr>
+              <w:rFonts w:asciiTheme="minorHAnsi" w:eastAsiaTheme="minorEastAsia" w:hAnsiTheme="minorHAnsi" w:cstheme="minorBidi"/>
+              <w:b w:val="0"/>
+              <w:noProof/>
+              <w:kern w:val="2"/>
+              <w:u w:val="none"/>
+              <w:lang w:eastAsia="tr-TR"/>
+              <w14:ligatures w14:val="standardContextual"/>
+            </w:rPr>
+          </w:pPr>
+          <w:hyperlink w:anchor="_Toc231228144" w:history="1">
+            <w:r>
+              <w:rPr>
+                <w:rStyle w:val="Kpr"/>
+                <w:noProof/>
+              </w:rPr>
+              <w:t>ADIM 2: Darboğaz Analizi ve Ağır Sorgu Senaryosu</w:t>
+            </w:r>
+            <w:r>
+              <w:rPr>
+                <w:noProof/>
+                <w:webHidden/>
+              </w:rPr>
+              <w:tab/>
+            </w:r>
+            <w:r>
+              <w:rPr>
+                <w:noProof/>
+                <w:webHidden/>
+              </w:rPr>
+              <w:fldChar w:fldCharType="begin"/>
+            </w:r>
+            <w:r>
+              <w:rPr>
+                <w:noProof/>
+                <w:webHidden/>
+              </w:rPr>
+              <w:instrText xml:space="preserve"> PAGEREF _Toc231228144 \h </w:instrText>
             </w:r>
             <w:r>
               <w:rPr>
@@ -537,787 +602,6 @@
           </w:hyperlink>
         </w:p>
         <w:p>
-          <w:pPr>
-            <w:pStyle w:val="T2"/>
-            <w:rPr>
-              <w:rFonts w:asciiTheme="minorHAnsi" w:eastAsiaTheme="minorEastAsia" w:hAnsiTheme="minorHAnsi" w:cstheme="minorBidi"/>
-              <w:b w:val="0"/>
-              <w:noProof/>
-              <w:kern w:val="2"/>
-              <w:u w:val="none"/>
-              <w:lang w:eastAsia="tr-TR"/>
-              <w14:ligatures w14:val="standardContextual"/>
-            </w:rPr>
-          </w:pPr>
-          <w:hyperlink w:anchor="_Toc227625953" w:history="1">
-            <w:r>
-              <w:rPr>
-                <w:rStyle w:val="Kpr"/>
-                <w:noProof/>
-              </w:rPr>
-              <w:t>Adım 1: Veri Kaynağı Kurulumu ve Tablo Yapılarının Doğrulanması</w:t>
-            </w:r>
-            <w:r>
-              <w:rPr>
-                <w:noProof/>
-                <w:webHidden/>
-              </w:rPr>
-              <w:tab/>
-            </w:r>
-            <w:r>
-              <w:rPr>
-                <w:noProof/>
-                <w:webHidden/>
-              </w:rPr>
-              <w:fldChar w:fldCharType="begin"/>
-            </w:r>
-            <w:r>
-              <w:rPr>
-                <w:noProof/>
-                <w:webHidden/>
-              </w:rPr>
-              <w:instrText xml:space="preserve"> PAGEREF _Toc227625953 \h </w:instrText>
-            </w:r>
-            <w:r>
-              <w:rPr>
-                <w:noProof/>
-                <w:webHidden/>
-              </w:rPr>
-            </w:r>
-            <w:r>
-              <w:rPr>
-                <w:noProof/>
-                <w:webHidden/>
-              </w:rPr>
-              <w:fldChar w:fldCharType="separate"/>
-            </w:r>
-            <w:r>
-              <w:rPr>
-                <w:noProof/>
-                <w:webHidden/>
-              </w:rPr>
-              <w:t>3</w:t>
-            </w:r>
-            <w:r>
-              <w:rPr>
-                <w:noProof/>
-                <w:webHidden/>
-              </w:rPr>
-              <w:fldChar w:fldCharType="end"/>
-            </w:r>
-          </w:hyperlink>
-        </w:p>
-        <w:p>
-          <w:pPr>
-            <w:pStyle w:val="T2"/>
-            <w:rPr>
-              <w:rFonts w:asciiTheme="minorHAnsi" w:eastAsiaTheme="minorEastAsia" w:hAnsiTheme="minorHAnsi" w:cstheme="minorBidi"/>
-              <w:b w:val="0"/>
-              <w:noProof/>
-              <w:kern w:val="2"/>
-              <w:u w:val="none"/>
-              <w:lang w:eastAsia="tr-TR"/>
-              <w14:ligatures w14:val="standardContextual"/>
-            </w:rPr>
-          </w:pPr>
-          <w:hyperlink w:anchor="_Toc227625954" w:history="1">
-            <w:r>
-              <w:rPr>
-                <w:rStyle w:val="Kpr"/>
-                <w:noProof/>
-              </w:rPr>
-              <w:t>Adım 2: Manuel Tam Yedek (Full Backup) ve Doğrulama Testi</w:t>
-            </w:r>
-            <w:r>
-              <w:rPr>
-                <w:noProof/>
-                <w:webHidden/>
-              </w:rPr>
-              <w:tab/>
-            </w:r>
-            <w:r>
-              <w:rPr>
-                <w:noProof/>
-                <w:webHidden/>
-              </w:rPr>
-              <w:fldChar w:fldCharType="begin"/>
-            </w:r>
-            <w:r>
-              <w:rPr>
-                <w:noProof/>
-                <w:webHidden/>
-              </w:rPr>
-              <w:instrText xml:space="preserve"> PAGEREF _Toc227625954 \h </w:instrText>
-            </w:r>
-            <w:r>
-              <w:rPr>
-                <w:noProof/>
-                <w:webHidden/>
-              </w:rPr>
-            </w:r>
-            <w:r>
-              <w:rPr>
-                <w:noProof/>
-                <w:webHidden/>
-              </w:rPr>
-              <w:fldChar w:fldCharType="separate"/>
-            </w:r>
-            <w:r>
-              <w:rPr>
-                <w:noProof/>
-                <w:webHidden/>
-              </w:rPr>
-              <w:t>4</w:t>
-            </w:r>
-            <w:r>
-              <w:rPr>
-                <w:noProof/>
-                <w:webHidden/>
-              </w:rPr>
-              <w:fldChar w:fldCharType="end"/>
-            </w:r>
-          </w:hyperlink>
-        </w:p>
-        <w:p>
-          <w:pPr>
-            <w:pStyle w:val="T2"/>
-            <w:rPr>
-              <w:rFonts w:asciiTheme="minorHAnsi" w:eastAsiaTheme="minorEastAsia" w:hAnsiTheme="minorHAnsi" w:cstheme="minorBidi"/>
-              <w:b w:val="0"/>
-              <w:noProof/>
-              <w:kern w:val="2"/>
-              <w:u w:val="none"/>
-              <w:lang w:eastAsia="tr-TR"/>
-              <w14:ligatures w14:val="standardContextual"/>
-            </w:rPr>
-          </w:pPr>
-          <w:hyperlink w:anchor="_Toc227625955" w:history="1">
-            <w:r>
-              <w:rPr>
-                <w:rStyle w:val="Kpr"/>
-                <w:noProof/>
-              </w:rPr>
-              <w:t>Adım 3: Fark (Differential) Yedeği Alma ve Karşılaştığım Sorun</w:t>
-            </w:r>
-            <w:r>
-              <w:rPr>
-                <w:noProof/>
-                <w:webHidden/>
-              </w:rPr>
-              <w:tab/>
-            </w:r>
-            <w:r>
-              <w:rPr>
-                <w:noProof/>
-                <w:webHidden/>
-              </w:rPr>
-              <w:fldChar w:fldCharType="begin"/>
-            </w:r>
-            <w:r>
-              <w:rPr>
-                <w:noProof/>
-                <w:webHidden/>
-              </w:rPr>
-              <w:instrText xml:space="preserve"> PAGEREF _Toc227625955 \h </w:instrText>
-            </w:r>
-            <w:r>
-              <w:rPr>
-                <w:noProof/>
-                <w:webHidden/>
-              </w:rPr>
-            </w:r>
-            <w:r>
-              <w:rPr>
-                <w:noProof/>
-                <w:webHidden/>
-              </w:rPr>
-              <w:fldChar w:fldCharType="separate"/>
-            </w:r>
-            <w:r>
-              <w:rPr>
-                <w:noProof/>
-                <w:webHidden/>
-              </w:rPr>
-              <w:t>5</w:t>
-            </w:r>
-            <w:r>
-              <w:rPr>
-                <w:noProof/>
-                <w:webHidden/>
-              </w:rPr>
-              <w:fldChar w:fldCharType="end"/>
-            </w:r>
-          </w:hyperlink>
-        </w:p>
-        <w:p>
-          <w:pPr>
-            <w:pStyle w:val="T2"/>
-            <w:rPr>
-              <w:rFonts w:asciiTheme="minorHAnsi" w:eastAsiaTheme="minorEastAsia" w:hAnsiTheme="minorHAnsi" w:cstheme="minorBidi"/>
-              <w:b w:val="0"/>
-              <w:noProof/>
-              <w:kern w:val="2"/>
-              <w:u w:val="none"/>
-              <w:lang w:eastAsia="tr-TR"/>
-              <w14:ligatures w14:val="standardContextual"/>
-            </w:rPr>
-          </w:pPr>
-          <w:hyperlink w:anchor="_Toc227625956" w:history="1">
-            <w:r>
-              <w:rPr>
-                <w:rStyle w:val="Kpr"/>
-                <w:noProof/>
-              </w:rPr>
-              <w:t>Adım 4: Otomatik Yedekleme Stratejisi ve Alternatif Çözüm</w:t>
-            </w:r>
-            <w:r>
-              <w:rPr>
-                <w:noProof/>
-                <w:webHidden/>
-              </w:rPr>
-              <w:tab/>
-            </w:r>
-            <w:r>
-              <w:rPr>
-                <w:noProof/>
-                <w:webHidden/>
-              </w:rPr>
-              <w:fldChar w:fldCharType="begin"/>
-            </w:r>
-            <w:r>
-              <w:rPr>
-                <w:noProof/>
-                <w:webHidden/>
-              </w:rPr>
-              <w:instrText xml:space="preserve"> PAGEREF _Toc227625956 \h </w:instrText>
-            </w:r>
-            <w:r>
-              <w:rPr>
-                <w:noProof/>
-                <w:webHidden/>
-              </w:rPr>
-            </w:r>
-            <w:r>
-              <w:rPr>
-                <w:noProof/>
-                <w:webHidden/>
-              </w:rPr>
-              <w:fldChar w:fldCharType="separate"/>
-            </w:r>
-            <w:r>
-              <w:rPr>
-                <w:noProof/>
-                <w:webHidden/>
-              </w:rPr>
-              <w:t>6</w:t>
-            </w:r>
-            <w:r>
-              <w:rPr>
-                <w:noProof/>
-                <w:webHidden/>
-              </w:rPr>
-              <w:fldChar w:fldCharType="end"/>
-            </w:r>
-          </w:hyperlink>
-        </w:p>
-        <w:p>
-          <w:pPr>
-            <w:pStyle w:val="T2"/>
-            <w:rPr>
-              <w:rFonts w:asciiTheme="minorHAnsi" w:eastAsiaTheme="minorEastAsia" w:hAnsiTheme="minorHAnsi" w:cstheme="minorBidi"/>
-              <w:b w:val="0"/>
-              <w:noProof/>
-              <w:kern w:val="2"/>
-              <w:u w:val="none"/>
-              <w:lang w:eastAsia="tr-TR"/>
-              <w14:ligatures w14:val="standardContextual"/>
-            </w:rPr>
-          </w:pPr>
-          <w:hyperlink w:anchor="_Toc227625957" w:history="1">
-            <w:r>
-              <w:rPr>
-                <w:rStyle w:val="Kpr"/>
-                <w:noProof/>
-              </w:rPr>
-              <w:t>Adım 5: Kurtarma Modu Değişimi ve Karşılaşılan Log Hatası</w:t>
-            </w:r>
-            <w:r>
-              <w:rPr>
-                <w:noProof/>
-                <w:webHidden/>
-              </w:rPr>
-              <w:tab/>
-            </w:r>
-            <w:r>
-              <w:rPr>
-                <w:noProof/>
-                <w:webHidden/>
-              </w:rPr>
-              <w:fldChar w:fldCharType="begin"/>
-            </w:r>
-            <w:r>
-              <w:rPr>
-                <w:noProof/>
-                <w:webHidden/>
-              </w:rPr>
-              <w:instrText xml:space="preserve"> PAGEREF _Toc227625957 \h </w:instrText>
-            </w:r>
-            <w:r>
-              <w:rPr>
-                <w:noProof/>
-                <w:webHidden/>
-              </w:rPr>
-            </w:r>
-            <w:r>
-              <w:rPr>
-                <w:noProof/>
-                <w:webHidden/>
-              </w:rPr>
-              <w:fldChar w:fldCharType="separate"/>
-            </w:r>
-            <w:r>
-              <w:rPr>
-                <w:noProof/>
-                <w:webHidden/>
-              </w:rPr>
-              <w:t>7</w:t>
-            </w:r>
-            <w:r>
-              <w:rPr>
-                <w:noProof/>
-                <w:webHidden/>
-              </w:rPr>
-              <w:fldChar w:fldCharType="end"/>
-            </w:r>
-          </w:hyperlink>
-        </w:p>
-        <w:p>
-          <w:pPr>
-            <w:pStyle w:val="T2"/>
-            <w:rPr>
-              <w:rFonts w:asciiTheme="minorHAnsi" w:eastAsiaTheme="minorEastAsia" w:hAnsiTheme="minorHAnsi" w:cstheme="minorBidi"/>
-              <w:b w:val="0"/>
-              <w:noProof/>
-              <w:kern w:val="2"/>
-              <w:u w:val="none"/>
-              <w:lang w:eastAsia="tr-TR"/>
-              <w14:ligatures w14:val="standardContextual"/>
-            </w:rPr>
-          </w:pPr>
-          <w:hyperlink w:anchor="_Toc227625958" w:history="1">
-            <w:r>
-              <w:rPr>
-                <w:rStyle w:val="Kpr"/>
-                <w:noProof/>
-              </w:rPr>
-              <w:t>Adım 6: Felaket Senaryosu ve Kurtarma İşlemi</w:t>
-            </w:r>
-            <w:r>
-              <w:rPr>
-                <w:noProof/>
-                <w:webHidden/>
-              </w:rPr>
-              <w:tab/>
-            </w:r>
-            <w:r>
-              <w:rPr>
-                <w:noProof/>
-                <w:webHidden/>
-              </w:rPr>
-              <w:fldChar w:fldCharType="begin"/>
-            </w:r>
-            <w:r>
-              <w:rPr>
-                <w:noProof/>
-                <w:webHidden/>
-              </w:rPr>
-              <w:instrText xml:space="preserve"> PAGEREF _Toc227625958 \h </w:instrText>
-            </w:r>
-            <w:r>
-              <w:rPr>
-                <w:noProof/>
-                <w:webHidden/>
-              </w:rPr>
-            </w:r>
-            <w:r>
-              <w:rPr>
-                <w:noProof/>
-                <w:webHidden/>
-              </w:rPr>
-              <w:fldChar w:fldCharType="separate"/>
-            </w:r>
-            <w:r>
-              <w:rPr>
-                <w:noProof/>
-                <w:webHidden/>
-              </w:rPr>
-              <w:t>8</w:t>
-            </w:r>
-            <w:r>
-              <w:rPr>
-                <w:noProof/>
-                <w:webHidden/>
-              </w:rPr>
-              <w:fldChar w:fldCharType="end"/>
-            </w:r>
-          </w:hyperlink>
-        </w:p>
-        <w:p>
-          <w:pPr>
-            <w:pStyle w:val="T2"/>
-            <w:rPr>
-              <w:rFonts w:asciiTheme="minorHAnsi" w:eastAsiaTheme="minorEastAsia" w:hAnsiTheme="minorHAnsi" w:cstheme="minorBidi"/>
-              <w:b w:val="0"/>
-              <w:noProof/>
-              <w:kern w:val="2"/>
-              <w:u w:val="none"/>
-              <w:lang w:eastAsia="tr-TR"/>
-              <w14:ligatures w14:val="standardContextual"/>
-            </w:rPr>
-          </w:pPr>
-          <w:hyperlink w:anchor="_Toc227625959" w:history="1">
-            <w:r>
-              <w:rPr>
-                <w:rStyle w:val="Kpr"/>
-                <w:noProof/>
-              </w:rPr>
-              <w:t>Adım 7: Yedekleme Planı Tablosu</w:t>
-            </w:r>
-            <w:r>
-              <w:rPr>
-                <w:noProof/>
-                <w:webHidden/>
-              </w:rPr>
-              <w:tab/>
-            </w:r>
-            <w:r>
-              <w:rPr>
-                <w:noProof/>
-                <w:webHidden/>
-              </w:rPr>
-              <w:fldChar w:fldCharType="begin"/>
-            </w:r>
-            <w:r>
-              <w:rPr>
-                <w:noProof/>
-                <w:webHidden/>
-              </w:rPr>
-              <w:instrText xml:space="preserve"> PAGEREF _Toc227625959 \h </w:instrText>
-            </w:r>
-            <w:r>
-              <w:rPr>
-                <w:noProof/>
-                <w:webHidden/>
-              </w:rPr>
-            </w:r>
-            <w:r>
-              <w:rPr>
-                <w:noProof/>
-                <w:webHidden/>
-              </w:rPr>
-              <w:fldChar w:fldCharType="separate"/>
-            </w:r>
-            <w:r>
-              <w:rPr>
-                <w:noProof/>
-                <w:webHidden/>
-              </w:rPr>
-              <w:t>10</w:t>
-            </w:r>
-            <w:r>
-              <w:rPr>
-                <w:noProof/>
-                <w:webHidden/>
-              </w:rPr>
-              <w:fldChar w:fldCharType="end"/>
-            </w:r>
-          </w:hyperlink>
-        </w:p>
-        <w:p>
-          <w:pPr>
-            <w:pStyle w:val="T2"/>
-            <w:rPr>
-              <w:rFonts w:asciiTheme="minorHAnsi" w:eastAsiaTheme="minorEastAsia" w:hAnsiTheme="minorHAnsi" w:cstheme="minorBidi"/>
-              <w:b w:val="0"/>
-              <w:noProof/>
-              <w:kern w:val="2"/>
-              <w:u w:val="none"/>
-              <w:lang w:eastAsia="tr-TR"/>
-              <w14:ligatures w14:val="standardContextual"/>
-            </w:rPr>
-          </w:pPr>
-          <w:hyperlink w:anchor="_Toc227625960" w:history="1">
-            <w:r>
-              <w:rPr>
-                <w:rStyle w:val="Kpr"/>
-                <w:noProof/>
-              </w:rPr>
-              <w:t>Adım 8: Tam Felaket Senaryosu - Veritabanı Silme ve Full Restore</w:t>
-            </w:r>
-            <w:r>
-              <w:rPr>
-                <w:noProof/>
-                <w:webHidden/>
-              </w:rPr>
-              <w:tab/>
-            </w:r>
-            <w:r>
-              <w:rPr>
-                <w:noProof/>
-                <w:webHidden/>
-              </w:rPr>
-              <w:fldChar w:fldCharType="begin"/>
-            </w:r>
-            <w:r>
-              <w:rPr>
-                <w:noProof/>
-                <w:webHidden/>
-              </w:rPr>
-              <w:instrText xml:space="preserve"> PAGEREF _Toc227625960 \h </w:instrText>
-            </w:r>
-            <w:r>
-              <w:rPr>
-                <w:noProof/>
-                <w:webHidden/>
-              </w:rPr>
-            </w:r>
-            <w:r>
-              <w:rPr>
-                <w:noProof/>
-                <w:webHidden/>
-              </w:rPr>
-              <w:fldChar w:fldCharType="separate"/>
-            </w:r>
-            <w:r>
-              <w:rPr>
-                <w:noProof/>
-                <w:webHidden/>
-              </w:rPr>
-              <w:t>11</w:t>
-            </w:r>
-            <w:r>
-              <w:rPr>
-                <w:noProof/>
-                <w:webHidden/>
-              </w:rPr>
-              <w:fldChar w:fldCharType="end"/>
-            </w:r>
-          </w:hyperlink>
-        </w:p>
-        <w:p>
-          <w:pPr>
-            <w:pStyle w:val="T2"/>
-            <w:rPr>
-              <w:rFonts w:asciiTheme="minorHAnsi" w:eastAsiaTheme="minorEastAsia" w:hAnsiTheme="minorHAnsi" w:cstheme="minorBidi"/>
-              <w:b w:val="0"/>
-              <w:noProof/>
-              <w:kern w:val="2"/>
-              <w:u w:val="none"/>
-              <w:lang w:eastAsia="tr-TR"/>
-              <w14:ligatures w14:val="standardContextual"/>
-            </w:rPr>
-          </w:pPr>
-          <w:hyperlink w:anchor="_Toc227625961" w:history="1">
-            <w:r>
-              <w:rPr>
-                <w:rStyle w:val="Kpr"/>
-                <w:noProof/>
-              </w:rPr>
-              <w:t>Adım 9:  SQL Server Agent Alternatifi Olarak Görev Zamanlayıcı Yapılandırması</w:t>
-            </w:r>
-            <w:r>
-              <w:rPr>
-                <w:noProof/>
-                <w:webHidden/>
-              </w:rPr>
-              <w:tab/>
-            </w:r>
-            <w:r>
-              <w:rPr>
-                <w:noProof/>
-                <w:webHidden/>
-              </w:rPr>
-              <w:fldChar w:fldCharType="begin"/>
-            </w:r>
-            <w:r>
-              <w:rPr>
-                <w:noProof/>
-                <w:webHidden/>
-              </w:rPr>
-              <w:instrText xml:space="preserve"> PAGEREF _Toc227625961 \h </w:instrText>
-            </w:r>
-            <w:r>
-              <w:rPr>
-                <w:noProof/>
-                <w:webHidden/>
-              </w:rPr>
-            </w:r>
-            <w:r>
-              <w:rPr>
-                <w:noProof/>
-                <w:webHidden/>
-              </w:rPr>
-              <w:fldChar w:fldCharType="separate"/>
-            </w:r>
-            <w:r>
-              <w:rPr>
-                <w:noProof/>
-                <w:webHidden/>
-              </w:rPr>
-              <w:t>12</w:t>
-            </w:r>
-            <w:r>
-              <w:rPr>
-                <w:noProof/>
-                <w:webHidden/>
-              </w:rPr>
-              <w:fldChar w:fldCharType="end"/>
-            </w:r>
-          </w:hyperlink>
-        </w:p>
-        <w:p>
-          <w:pPr>
-            <w:pStyle w:val="T2"/>
-            <w:rPr>
-              <w:rFonts w:asciiTheme="minorHAnsi" w:eastAsiaTheme="minorEastAsia" w:hAnsiTheme="minorHAnsi" w:cstheme="minorBidi"/>
-              <w:b w:val="0"/>
-              <w:noProof/>
-              <w:kern w:val="2"/>
-              <w:u w:val="none"/>
-              <w:lang w:eastAsia="tr-TR"/>
-              <w14:ligatures w14:val="standardContextual"/>
-            </w:rPr>
-          </w:pPr>
-          <w:hyperlink w:anchor="_Toc227625962" w:history="1">
-            <w:r>
-              <w:rPr>
-                <w:rStyle w:val="Kpr"/>
-                <w:noProof/>
-              </w:rPr>
-              <w:t>Adım 10: Yedekleme Stratejisi ve Verimlilik Analizi</w:t>
-            </w:r>
-            <w:r>
-              <w:rPr>
-                <w:noProof/>
-                <w:webHidden/>
-              </w:rPr>
-              <w:tab/>
-            </w:r>
-            <w:r>
-              <w:rPr>
-                <w:noProof/>
-                <w:webHidden/>
-              </w:rPr>
-              <w:fldChar w:fldCharType="begin"/>
-            </w:r>
-            <w:r>
-              <w:rPr>
-                <w:noProof/>
-                <w:webHidden/>
-              </w:rPr>
-              <w:instrText xml:space="preserve"> PAGEREF _Toc227625962 \h </w:instrText>
-            </w:r>
-            <w:r>
-              <w:rPr>
-                <w:noProof/>
-                <w:webHidden/>
-              </w:rPr>
-            </w:r>
-            <w:r>
-              <w:rPr>
-                <w:noProof/>
-                <w:webHidden/>
-              </w:rPr>
-              <w:fldChar w:fldCharType="separate"/>
-            </w:r>
-            <w:r>
-              <w:rPr>
-                <w:noProof/>
-                <w:webHidden/>
-              </w:rPr>
-              <w:t>13</w:t>
-            </w:r>
-            <w:r>
-              <w:rPr>
-                <w:noProof/>
-                <w:webHidden/>
-              </w:rPr>
-              <w:fldChar w:fldCharType="end"/>
-            </w:r>
-          </w:hyperlink>
-        </w:p>
-        <w:p>
-          <w:pPr>
-            <w:pStyle w:val="T2"/>
-            <w:rPr>
-              <w:rFonts w:asciiTheme="minorHAnsi" w:eastAsiaTheme="minorEastAsia" w:hAnsiTheme="minorHAnsi" w:cstheme="minorBidi"/>
-              <w:b w:val="0"/>
-              <w:noProof/>
-              <w:kern w:val="2"/>
-              <w:u w:val="none"/>
-              <w:lang w:eastAsia="tr-TR"/>
-              <w14:ligatures w14:val="standardContextual"/>
-            </w:rPr>
-          </w:pPr>
-          <w:hyperlink w:anchor="_Toc227625963" w:history="1">
-            <w:r>
-              <w:rPr>
-                <w:rStyle w:val="Kpr"/>
-                <w:noProof/>
-              </w:rPr>
-              <w:t>Sonuç</w:t>
-            </w:r>
-            <w:r>
-              <w:rPr>
-                <w:noProof/>
-                <w:webHidden/>
-              </w:rPr>
-              <w:tab/>
-            </w:r>
-            <w:r>
-              <w:rPr>
-                <w:noProof/>
-                <w:webHidden/>
-              </w:rPr>
-              <w:fldChar w:fldCharType="begin"/>
-            </w:r>
-            <w:r>
-              <w:rPr>
-                <w:noProof/>
-                <w:webHidden/>
-              </w:rPr>
-              <w:instrText xml:space="preserve"> PAGEREF _Toc227625963 \h </w:instrText>
-            </w:r>
-            <w:r>
-              <w:rPr>
-                <w:noProof/>
-                <w:webHidden/>
-              </w:rPr>
-            </w:r>
-            <w:r>
-              <w:rPr>
-                <w:noProof/>
-                <w:webHidden/>
-              </w:rPr>
-              <w:fldChar w:fldCharType="separate"/>
-            </w:r>
-            <w:r>
-              <w:rPr>
-                <w:noProof/>
-                <w:webHidden/>
-              </w:rPr>
-              <w:t>14</w:t>
-            </w:r>
-            <w:r>
-              <w:rPr>
-                <w:noProof/>
-                <w:webHidden/>
-              </w:rPr>
-              <w:fldChar w:fldCharType="end"/>
-            </w:r>
-          </w:hyperlink>
-        </w:p>
-        <w:p>
           <w:r>
             <w:rPr>
               <w:b/>
@@ -1339,6 +623,17 @@
     <w:p/>
     <w:p/>
     <w:p/>
+    <w:p/>
+    <w:p/>
+    <w:p/>
+    <w:p/>
+    <w:p/>
+    <w:p/>
+    <w:p/>
+    <w:p/>
+    <w:p/>
+    <w:p/>
+    <w:p/>
     <w:p>
       <w:pPr>
         <w:pStyle w:val="Balk1"/>
@@ -1349,7 +644,7 @@
           <w:color w:val="000000" w:themeColor="text1"/>
         </w:rPr>
       </w:pPr>
-      <w:bookmarkStart w:id="1" w:name="_Toc227625952"/>
+      <w:bookmarkStart w:id="0" w:name="_Toc231228142"/>
       <w:r>
         <w:rPr>
           <w:b/>
@@ -1375,7 +670,6 @@
         </w:rPr>
         <w:t xml:space="preserve">: </w:t>
       </w:r>
-      <w:bookmarkEnd w:id="1"/>
       <w:proofErr w:type="spellStart"/>
       <w:r>
         <w:rPr>
@@ -1394,6 +688,7 @@
         </w:rPr>
         <w:t xml:space="preserve"> Performans Optimizasyonu ve İzleme</w:t>
       </w:r>
+      <w:bookmarkEnd w:id="0"/>
     </w:p>
     <w:p>
       <w:r>
@@ -1404,6 +699,7 @@
       <w:pPr>
         <w:pStyle w:val="Balk2"/>
       </w:pPr>
+      <w:bookmarkStart w:id="1" w:name="_Toc231228143"/>
       <w:r>
         <w:t xml:space="preserve">ADIM 1: </w:t>
       </w:r>
@@ -1415,6 +711,7 @@
       <w:r>
         <w:t xml:space="preserve"> Altyapısının Kurulması ve Hazırlık Süreci</w:t>
       </w:r>
+      <w:bookmarkEnd w:id="1"/>
     </w:p>
     <w:p>
       <w:r>
@@ -1682,16 +979,14 @@
     <w:p>
       <w:r>
         <w:lastRenderedPageBreak/>
-        <w:t>01.06</w:t>
-      </w:r>
-      <w:r>
-        <w:t>.2026</w:t>
+        <w:t>01.06.2026</w:t>
       </w:r>
     </w:p>
     <w:p>
       <w:pPr>
         <w:pStyle w:val="Balk2"/>
       </w:pPr>
+      <w:bookmarkStart w:id="2" w:name="_Toc231228144"/>
       <w:r>
         <w:t xml:space="preserve">ADIM </w:t>
       </w:r>
@@ -1704,6 +999,7 @@
       <w:r>
         <w:t>Darboğaz Analizi ve Ağır Sorgu Senaryosu</w:t>
       </w:r>
+      <w:bookmarkEnd w:id="2"/>
     </w:p>
     <w:p>
       <w:proofErr w:type="spellStart"/>
@@ -1712,7 +1008,15 @@
       </w:r>
       <w:proofErr w:type="spellEnd"/>
       <w:r>
-        <w:t xml:space="preserve"> optimizasyon süreçlerinin ilk aşaması olarak , sistemdeki eksik indeksleri ve performans kayıplarını tespit etmek amacıyla </w:t>
+        <w:t xml:space="preserve"> optimizasyon süreçlerinin ilk aşaması </w:t>
+      </w:r>
+      <w:proofErr w:type="gramStart"/>
+      <w:r>
+        <w:t>olarak ,</w:t>
+      </w:r>
+      <w:proofErr w:type="gramEnd"/>
+      <w:r>
+        <w:t xml:space="preserve"> sistemdeki eksik indeksleri ve performans kayıplarını tespit etmek amacıyla </w:t>
       </w:r>
       <w:proofErr w:type="spellStart"/>
       <w:r>
@@ -1822,6 +1126,9 @@
     <w:p/>
     <w:p>
       <w:r>
+        <w:rPr>
+          <w:noProof/>
+        </w:rPr>
         <w:drawing>
           <wp:inline distT="0" distB="0" distL="0" distR="0" wp14:anchorId="3259E5AC" wp14:editId="17CB8B66">
             <wp:extent cx="5829300" cy="1630680"/>
@@ -1913,6 +1220,212 @@
       </w:r>
     </w:p>
     <w:p/>
+    <w:p>
+      <w:r>
+        <w:t>01.06.2026</w:t>
+      </w:r>
+    </w:p>
+    <w:p>
+      <w:pPr>
+        <w:pStyle w:val="Balk2"/>
+      </w:pPr>
+      <w:r>
+        <w:t>ADIM 3: İndeks Yapılandırması ve Performans Optimizasyonu</w:t>
+      </w:r>
+    </w:p>
+    <w:p>
+      <w:r>
+        <w:t xml:space="preserve">Tespit edilen performans darboğazını gidermek amacıyla, Query </w:t>
+      </w:r>
+      <w:proofErr w:type="spellStart"/>
+      <w:r>
+        <w:t>Optimizer'ın</w:t>
+      </w:r>
+      <w:proofErr w:type="spellEnd"/>
+      <w:r>
+        <w:t xml:space="preserve"> önerdiği doğrultuda </w:t>
+      </w:r>
+      <w:proofErr w:type="spellStart"/>
+      <w:r>
+        <w:t>Sales.SalesOrderDetail</w:t>
+      </w:r>
+      <w:proofErr w:type="spellEnd"/>
+      <w:r>
+        <w:t xml:space="preserve"> tablosunun </w:t>
+      </w:r>
+      <w:proofErr w:type="spellStart"/>
+      <w:r>
+        <w:t>LineTotal</w:t>
+      </w:r>
+      <w:proofErr w:type="spellEnd"/>
+      <w:r>
+        <w:t xml:space="preserve"> ve </w:t>
+      </w:r>
+      <w:proofErr w:type="spellStart"/>
+      <w:r>
+        <w:t>ModifiedDate</w:t>
+      </w:r>
+      <w:proofErr w:type="spellEnd"/>
+      <w:r>
+        <w:t xml:space="preserve"> kolonlarını kapsayan bir </w:t>
+      </w:r>
+      <w:proofErr w:type="spellStart"/>
+      <w:r>
+        <w:t>Non-Clustered</w:t>
+      </w:r>
+      <w:proofErr w:type="spellEnd"/>
+      <w:r>
+        <w:t xml:space="preserve"> Index (Kümelenmemiş Dizin) yapısı sisteme entegre edilmiştir. </w:t>
+      </w:r>
+    </w:p>
+    <w:p/>
+    <w:p>
+      <w:r>
+        <w:rPr>
+          <w:b/>
+          <w:bCs/>
+        </w:rPr>
+        <w:lastRenderedPageBreak/>
+        <w:t>Optimizasyon Sonrası Bulgular:</w:t>
+      </w:r>
+    </w:p>
+    <w:p>
+      <w:pPr>
+        <w:numPr>
+          <w:ilvl w:val="0"/>
+          <w:numId w:val="2"/>
+        </w:numPr>
+      </w:pPr>
+      <w:r>
+        <w:t xml:space="preserve">İndeksleme işlemi sonrasında ağır sorgu yeniden test edilmiş ve yürütme planındaki yeşil renkli "Eksik Dizin" uyarısının tamamen ortadan kalktığı görülmüştür.  </w:t>
+      </w:r>
+    </w:p>
+    <w:p>
+      <w:pPr>
+        <w:numPr>
+          <w:ilvl w:val="0"/>
+          <w:numId w:val="2"/>
+        </w:numPr>
+      </w:pPr>
+      <w:r>
+        <w:t xml:space="preserve">Sistemin tüm tabloyu satır </w:t>
+      </w:r>
+      <w:proofErr w:type="spellStart"/>
+      <w:r>
+        <w:t>satır</w:t>
+      </w:r>
+      <w:proofErr w:type="spellEnd"/>
+      <w:r>
+        <w:t xml:space="preserve"> okuduğu </w:t>
+      </w:r>
+      <w:proofErr w:type="spellStart"/>
+      <w:r>
+        <w:rPr>
+          <w:i/>
+          <w:iCs/>
+        </w:rPr>
+        <w:t>Clustered</w:t>
+      </w:r>
+      <w:proofErr w:type="spellEnd"/>
+      <w:r>
+        <w:rPr>
+          <w:i/>
+          <w:iCs/>
+        </w:rPr>
+        <w:t xml:space="preserve"> Index </w:t>
+      </w:r>
+      <w:proofErr w:type="spellStart"/>
+      <w:r>
+        <w:rPr>
+          <w:i/>
+          <w:iCs/>
+        </w:rPr>
+        <w:t>Scan</w:t>
+      </w:r>
+      <w:proofErr w:type="spellEnd"/>
+      <w:r>
+        <w:t xml:space="preserve"> operasyonu, yerini doğrudan hedef verilere odaklanan verimli bir </w:t>
+      </w:r>
+      <w:proofErr w:type="spellStart"/>
+      <w:r>
+        <w:t>Non-Clustered</w:t>
+      </w:r>
+      <w:proofErr w:type="spellEnd"/>
+      <w:r>
+        <w:t xml:space="preserve"> Index </w:t>
+      </w:r>
+      <w:proofErr w:type="spellStart"/>
+      <w:r>
+        <w:t>Seek</w:t>
+      </w:r>
+      <w:proofErr w:type="spellEnd"/>
+      <w:r>
+        <w:t xml:space="preserve"> (Dizin Arama) işlemine bırakmıştır. </w:t>
+      </w:r>
+    </w:p>
+    <w:p>
+      <w:pPr>
+        <w:numPr>
+          <w:ilvl w:val="0"/>
+          <w:numId w:val="2"/>
+        </w:numPr>
+      </w:pPr>
+      <w:r>
+        <w:t xml:space="preserve">Yapılan bu indeks yönetimi sayesinde sorgunun disk okuma ve işlem maliyetleri radikal bir şekilde düşürülerek </w:t>
+      </w:r>
+      <w:proofErr w:type="spellStart"/>
+      <w:r>
+        <w:t>veritabanı</w:t>
+      </w:r>
+      <w:proofErr w:type="spellEnd"/>
+      <w:r>
+        <w:t xml:space="preserve"> performansı optimize edilmiştir.</w:t>
+      </w:r>
+    </w:p>
+    <w:p>
+      <w:pPr>
+        <w:ind w:left="720"/>
+      </w:pPr>
+    </w:p>
+    <w:p>
+      <w:r>
+        <w:drawing>
+          <wp:inline distT="0" distB="0" distL="0" distR="0" wp14:anchorId="25CA2368" wp14:editId="322F1249">
+            <wp:extent cx="5760720" cy="1165860"/>
+            <wp:effectExtent l="0" t="0" r="0" b="0"/>
+            <wp:docPr id="2003382645" name="Resim 1" descr="metin, ekran görüntüsü, yazı tipi içeren bir resim&#10;&#10;Yapay zeka tarafından oluşturulmuş içerik yanlış olabilir."/>
+            <wp:cNvGraphicFramePr>
+              <a:graphicFrameLocks xmlns:a="http://schemas.openxmlformats.org/drawingml/2006/main" noChangeAspect="1"/>
+            </wp:cNvGraphicFramePr>
+            <a:graphic xmlns:a="http://schemas.openxmlformats.org/drawingml/2006/main">
+              <a:graphicData uri="http://schemas.openxmlformats.org/drawingml/2006/picture">
+                <pic:pic xmlns:pic="http://schemas.openxmlformats.org/drawingml/2006/picture">
+                  <pic:nvPicPr>
+                    <pic:cNvPr id="2003382645" name="Resim 1" descr="metin, ekran görüntüsü, yazı tipi içeren bir resim&#10;&#10;Yapay zeka tarafından oluşturulmuş içerik yanlış olabilir."/>
+                    <pic:cNvPicPr/>
+                  </pic:nvPicPr>
+                  <pic:blipFill>
+                    <a:blip r:embed="rId8"/>
+                    <a:stretch>
+                      <a:fillRect/>
+                    </a:stretch>
+                  </pic:blipFill>
+                  <pic:spPr>
+                    <a:xfrm>
+                      <a:off x="0" y="0"/>
+                      <a:ext cx="5760720" cy="1165860"/>
+                    </a:xfrm>
+                    <a:prstGeom prst="rect">
+                      <a:avLst/>
+                    </a:prstGeom>
+                  </pic:spPr>
+                </pic:pic>
+              </a:graphicData>
+            </a:graphic>
+          </wp:inline>
+        </w:drawing>
+      </w:r>
+    </w:p>
     <w:p/>
     <w:p/>
     <w:sectPr>
@@ -1928,6 +1441,155 @@
 <file path=word/numbering.xml><?xml version="1.0" encoding="utf-8"?>
 <w:numbering xmlns:wpc="http://schemas.microsoft.com/office/word/2010/wordprocessingCanvas" xmlns:cx="http://schemas.microsoft.com/office/drawing/2014/chartex" xmlns:cx1="http://schemas.microsoft.com/office/drawing/2015/9/8/chartex" xmlns:cx2="http://schemas.microsoft.com/office/drawing/2015/10/21/chartex" xmlns:cx3="http://schemas.microsoft.com/office/drawing/2016/5/9/chartex" xmlns:cx4="http://schemas.microsoft.com/office/drawing/2016/5/10/chartex" xmlns:cx5="http://schemas.microsoft.com/office/drawing/2016/5/11/chartex" xmlns:cx6="http://schemas.microsoft.com/office/drawing/2016/5/12/chartex" xmlns:cx7="http://schemas.microsoft.com/office/drawing/2016/5/13/chartex" xmlns:cx8="http://schemas.microsoft.com/office/drawing/2016/5/14/chartex" xmlns:mc="http://schemas.openxmlformats.org/markup-compatibility/2006" xmlns:aink="http://schemas.microsoft.com/office/drawing/2016/ink" xmlns:am3d="http://schemas.microsoft.com/office/drawing/2017/model3d" xmlns:o="urn:schemas-microsoft-com:office:office" xmlns:oel="http://schemas.microsoft.com/office/2019/extlst" xmlns:r="http://schemas.openxmlformats.org/officeDocument/2006/relationships" xmlns:m="http://schemas.openxmlformats.org/officeDocument/2006/math" xmlns:v="urn:schemas-microsoft-com:vml" xmlns:wp14="http://schemas.microsoft.com/office/word/2010/wordprocessingDrawing" xmlns:wp="http://schemas.openxmlformats.org/drawingml/2006/wordprocessingDrawing" xmlns:w10="urn:schemas-microsoft-com:office:word" xmlns:w="http://schemas.openxmlformats.org/wordprocessingml/2006/main" xmlns:w14="http://schemas.microsoft.com/office/word/2010/wordml" xmlns:w15="http://schemas.microsoft.com/office/word/2012/wordml" xmlns:w16cex="http://schemas.microsoft.com/office/word/2018/wordml/cex" xmlns:w16cid="http://schemas.microsoft.com/office/word/2016/wordml/cid" xmlns:w16="http://schemas.microsoft.com/office/word/2018/wordml" xmlns:w16du="http://schemas.microsoft.com/office/word/2023/wordml/word16du" xmlns:w16sdtdh="http://schemas.microsoft.com/office/word/2020/wordml/sdtdatahash" xmlns:w16sdtfl="http://schemas.microsoft.com/office/word/2024/wordml/sdtformatlock" xmlns:w16se="http://schemas.microsoft.com/office/word/2015/wordml/symex" xmlns:wpg="http://schemas.microsoft.com/office/word/2010/wordprocessingGroup" xmlns:wpi="http://schemas.microsoft.com/office/word/2010/wordprocessingInk" xmlns:wne="http://schemas.microsoft.com/office/word/2006/wordml" xmlns:wps="http://schemas.microsoft.com/office/word/2010/wordprocessingShape" mc:Ignorable="w14 w15 w16se w16cid w16 w16cex w16sdtdh w16sdtfl w16du wp14">
   <w:abstractNum w:abstractNumId="0" w15:restartNumberingAfterBreak="0">
+    <w:nsid w:val="30C24743"/>
+    <w:multiLevelType w:val="multilevel"/>
+    <w:tmpl w:val="1A7C491A"/>
+    <w:lvl w:ilvl="0">
+      <w:start w:val="1"/>
+      <w:numFmt w:val="bullet"/>
+      <w:lvlText w:val=""/>
+      <w:lvlJc w:val="left"/>
+      <w:pPr>
+        <w:tabs>
+          <w:tab w:val="num" w:pos="720"/>
+        </w:tabs>
+        <w:ind w:left="720" w:hanging="360"/>
+      </w:pPr>
+      <w:rPr>
+        <w:rFonts w:ascii="Symbol" w:hAnsi="Symbol" w:hint="default"/>
+        <w:sz w:val="20"/>
+      </w:rPr>
+    </w:lvl>
+    <w:lvl w:ilvl="1" w:tentative="1">
+      <w:start w:val="1"/>
+      <w:numFmt w:val="bullet"/>
+      <w:lvlText w:val="o"/>
+      <w:lvlJc w:val="left"/>
+      <w:pPr>
+        <w:tabs>
+          <w:tab w:val="num" w:pos="1440"/>
+        </w:tabs>
+        <w:ind w:left="1440" w:hanging="360"/>
+      </w:pPr>
+      <w:rPr>
+        <w:rFonts w:ascii="Courier New" w:hAnsi="Courier New" w:hint="default"/>
+        <w:sz w:val="20"/>
+      </w:rPr>
+    </w:lvl>
+    <w:lvl w:ilvl="2" w:tentative="1">
+      <w:start w:val="1"/>
+      <w:numFmt w:val="bullet"/>
+      <w:lvlText w:val=""/>
+      <w:lvlJc w:val="left"/>
+      <w:pPr>
+        <w:tabs>
+          <w:tab w:val="num" w:pos="2160"/>
+        </w:tabs>
+        <w:ind w:left="2160" w:hanging="360"/>
+      </w:pPr>
+      <w:rPr>
+        <w:rFonts w:ascii="Wingdings" w:hAnsi="Wingdings" w:hint="default"/>
+        <w:sz w:val="20"/>
+      </w:rPr>
+    </w:lvl>
+    <w:lvl w:ilvl="3" w:tentative="1">
+      <w:start w:val="1"/>
+      <w:numFmt w:val="bullet"/>
+      <w:lvlText w:val=""/>
+      <w:lvlJc w:val="left"/>
+      <w:pPr>
+        <w:tabs>
+          <w:tab w:val="num" w:pos="2880"/>
+        </w:tabs>
+        <w:ind w:left="2880" w:hanging="360"/>
+      </w:pPr>
+      <w:rPr>
+        <w:rFonts w:ascii="Wingdings" w:hAnsi="Wingdings" w:hint="default"/>
+        <w:sz w:val="20"/>
+      </w:rPr>
+    </w:lvl>
+    <w:lvl w:ilvl="4" w:tentative="1">
+      <w:start w:val="1"/>
+      <w:numFmt w:val="bullet"/>
+      <w:lvlText w:val=""/>
+      <w:lvlJc w:val="left"/>
+      <w:pPr>
+        <w:tabs>
+          <w:tab w:val="num" w:pos="3600"/>
+        </w:tabs>
+        <w:ind w:left="3600" w:hanging="360"/>
+      </w:pPr>
+      <w:rPr>
+        <w:rFonts w:ascii="Wingdings" w:hAnsi="Wingdings" w:hint="default"/>
+        <w:sz w:val="20"/>
+      </w:rPr>
+    </w:lvl>
+    <w:lvl w:ilvl="5" w:tentative="1">
+      <w:start w:val="1"/>
+      <w:numFmt w:val="bullet"/>
+      <w:lvlText w:val=""/>
+      <w:lvlJc w:val="left"/>
+      <w:pPr>
+        <w:tabs>
+          <w:tab w:val="num" w:pos="4320"/>
+        </w:tabs>
+        <w:ind w:left="4320" w:hanging="360"/>
+      </w:pPr>
+      <w:rPr>
+        <w:rFonts w:ascii="Wingdings" w:hAnsi="Wingdings" w:hint="default"/>
+        <w:sz w:val="20"/>
+      </w:rPr>
+    </w:lvl>
+    <w:lvl w:ilvl="6" w:tentative="1">
+      <w:start w:val="1"/>
+      <w:numFmt w:val="bullet"/>
+      <w:lvlText w:val=""/>
+      <w:lvlJc w:val="left"/>
+      <w:pPr>
+        <w:tabs>
+          <w:tab w:val="num" w:pos="5040"/>
+        </w:tabs>
+        <w:ind w:left="5040" w:hanging="360"/>
+      </w:pPr>
+      <w:rPr>
+        <w:rFonts w:ascii="Wingdings" w:hAnsi="Wingdings" w:hint="default"/>
+        <w:sz w:val="20"/>
+      </w:rPr>
+    </w:lvl>
+    <w:lvl w:ilvl="7" w:tentative="1">
+      <w:start w:val="1"/>
+      <w:numFmt w:val="bullet"/>
+      <w:lvlText w:val=""/>
+      <w:lvlJc w:val="left"/>
+      <w:pPr>
+        <w:tabs>
+          <w:tab w:val="num" w:pos="5760"/>
+        </w:tabs>
+        <w:ind w:left="5760" w:hanging="360"/>
+      </w:pPr>
+      <w:rPr>
+        <w:rFonts w:ascii="Wingdings" w:hAnsi="Wingdings" w:hint="default"/>
+        <w:sz w:val="20"/>
+      </w:rPr>
+    </w:lvl>
+    <w:lvl w:ilvl="8" w:tentative="1">
+      <w:start w:val="1"/>
+      <w:numFmt w:val="bullet"/>
+      <w:lvlText w:val=""/>
+      <w:lvlJc w:val="left"/>
+      <w:pPr>
+        <w:tabs>
+          <w:tab w:val="num" w:pos="6480"/>
+        </w:tabs>
+        <w:ind w:left="6480" w:hanging="360"/>
+      </w:pPr>
+      <w:rPr>
+        <w:rFonts w:ascii="Wingdings" w:hAnsi="Wingdings" w:hint="default"/>
+        <w:sz w:val="20"/>
+      </w:rPr>
+    </w:lvl>
+  </w:abstractNum>
+  <w:abstractNum w:abstractNumId="1" w15:restartNumberingAfterBreak="0">
     <w:nsid w:val="69DD104A"/>
     <w:multiLevelType w:val="multilevel"/>
     <w:tmpl w:val="31AE70C4"/>
@@ -2041,6 +1703,9 @@
     </w:lvl>
   </w:abstractNum>
   <w:num w:numId="1" w16cid:durableId="1283733942">
+    <w:abstractNumId w:val="1"/>
+  </w:num>
+  <w:num w:numId="2" w16cid:durableId="1760246595">
     <w:abstractNumId w:val="0"/>
   </w:num>
 </w:numbering>

</xml_diff>

<commit_message>
Proje 1: DMV izleme sorgusu eklendi ve performans raporu güncellendi
</commit_message>
<xml_diff>
--- a/BLM4522_Proje1/Proje1_Rapor.docx
+++ b/BLM4522_Proje1/Proje1_Rapor.docx
@@ -400,7 +400,7 @@
           <w:r>
             <w:fldChar w:fldCharType="separate"/>
           </w:r>
-          <w:hyperlink w:anchor="_Toc231228142" w:history="1">
+          <w:hyperlink w:anchor="_Toc231228825" w:history="1">
             <w:r>
               <w:rPr>
                 <w:rStyle w:val="Kpr"/>
@@ -428,7 +428,7 @@
                 <w:noProof/>
                 <w:webHidden/>
               </w:rPr>
-              <w:instrText xml:space="preserve"> PAGEREF _Toc231228142 \h </w:instrText>
+              <w:instrText xml:space="preserve"> PAGEREF _Toc231228825 \h </w:instrText>
             </w:r>
             <w:r>
               <w:rPr>
@@ -448,7 +448,7 @@
                 <w:noProof/>
                 <w:webHidden/>
               </w:rPr>
-              <w:t>2</w:t>
+              <w:t>3</w:t>
             </w:r>
             <w:r>
               <w:rPr>
@@ -472,7 +472,7 @@
               <w14:ligatures w14:val="standardContextual"/>
             </w:rPr>
           </w:pPr>
-          <w:hyperlink w:anchor="_Toc231228143" w:history="1">
+          <w:hyperlink w:anchor="_Toc231228826" w:history="1">
             <w:r>
               <w:rPr>
                 <w:rStyle w:val="Kpr"/>
@@ -499,7 +499,7 @@
                 <w:noProof/>
                 <w:webHidden/>
               </w:rPr>
-              <w:instrText xml:space="preserve"> PAGEREF _Toc231228143 \h </w:instrText>
+              <w:instrText xml:space="preserve"> PAGEREF _Toc231228826 \h </w:instrText>
             </w:r>
             <w:r>
               <w:rPr>
@@ -519,7 +519,7 @@
                 <w:noProof/>
                 <w:webHidden/>
               </w:rPr>
-              <w:t>2</w:t>
+              <w:t>3</w:t>
             </w:r>
             <w:r>
               <w:rPr>
@@ -543,7 +543,7 @@
               <w14:ligatures w14:val="standardContextual"/>
             </w:rPr>
           </w:pPr>
-          <w:hyperlink w:anchor="_Toc231228144" w:history="1">
+          <w:hyperlink w:anchor="_Toc231228827" w:history="1">
             <w:r>
               <w:rPr>
                 <w:rStyle w:val="Kpr"/>
@@ -570,7 +570,7 @@
                 <w:noProof/>
                 <w:webHidden/>
               </w:rPr>
-              <w:instrText xml:space="preserve"> PAGEREF _Toc231228144 \h </w:instrText>
+              <w:instrText xml:space="preserve"> PAGEREF _Toc231228827 \h </w:instrText>
             </w:r>
             <w:r>
               <w:rPr>
@@ -590,7 +590,149 @@
                 <w:noProof/>
                 <w:webHidden/>
               </w:rPr>
-              <w:t>3</w:t>
+              <w:t>4</w:t>
+            </w:r>
+            <w:r>
+              <w:rPr>
+                <w:noProof/>
+                <w:webHidden/>
+              </w:rPr>
+              <w:fldChar w:fldCharType="end"/>
+            </w:r>
+          </w:hyperlink>
+        </w:p>
+        <w:p>
+          <w:pPr>
+            <w:pStyle w:val="T2"/>
+            <w:rPr>
+              <w:rFonts w:asciiTheme="minorHAnsi" w:eastAsiaTheme="minorEastAsia" w:hAnsiTheme="minorHAnsi" w:cstheme="minorBidi"/>
+              <w:b w:val="0"/>
+              <w:noProof/>
+              <w:kern w:val="2"/>
+              <w:u w:val="none"/>
+              <w:lang w:eastAsia="tr-TR"/>
+              <w14:ligatures w14:val="standardContextual"/>
+            </w:rPr>
+          </w:pPr>
+          <w:hyperlink w:anchor="_Toc231228828" w:history="1">
+            <w:r>
+              <w:rPr>
+                <w:rStyle w:val="Kpr"/>
+                <w:noProof/>
+              </w:rPr>
+              <w:t>ADIM 3: İndeks Yapılandırması ve Performans Optimizasyonu</w:t>
+            </w:r>
+            <w:r>
+              <w:rPr>
+                <w:noProof/>
+                <w:webHidden/>
+              </w:rPr>
+              <w:tab/>
+            </w:r>
+            <w:r>
+              <w:rPr>
+                <w:noProof/>
+                <w:webHidden/>
+              </w:rPr>
+              <w:fldChar w:fldCharType="begin"/>
+            </w:r>
+            <w:r>
+              <w:rPr>
+                <w:noProof/>
+                <w:webHidden/>
+              </w:rPr>
+              <w:instrText xml:space="preserve"> PAGEREF _Toc231228828 \h </w:instrText>
+            </w:r>
+            <w:r>
+              <w:rPr>
+                <w:noProof/>
+                <w:webHidden/>
+              </w:rPr>
+            </w:r>
+            <w:r>
+              <w:rPr>
+                <w:noProof/>
+                <w:webHidden/>
+              </w:rPr>
+              <w:fldChar w:fldCharType="separate"/>
+            </w:r>
+            <w:r>
+              <w:rPr>
+                <w:noProof/>
+                <w:webHidden/>
+              </w:rPr>
+              <w:t>4</w:t>
+            </w:r>
+            <w:r>
+              <w:rPr>
+                <w:noProof/>
+                <w:webHidden/>
+              </w:rPr>
+              <w:fldChar w:fldCharType="end"/>
+            </w:r>
+          </w:hyperlink>
+        </w:p>
+        <w:p>
+          <w:pPr>
+            <w:pStyle w:val="T2"/>
+            <w:rPr>
+              <w:rFonts w:asciiTheme="minorHAnsi" w:eastAsiaTheme="minorEastAsia" w:hAnsiTheme="minorHAnsi" w:cstheme="minorBidi"/>
+              <w:b w:val="0"/>
+              <w:noProof/>
+              <w:kern w:val="2"/>
+              <w:u w:val="none"/>
+              <w:lang w:eastAsia="tr-TR"/>
+              <w14:ligatures w14:val="standardContextual"/>
+            </w:rPr>
+          </w:pPr>
+          <w:hyperlink w:anchor="_Toc231228829" w:history="1">
+            <w:r>
+              <w:rPr>
+                <w:rStyle w:val="Kpr"/>
+                <w:noProof/>
+              </w:rPr>
+              <w:t>ADIM 4: Dynamic Management Views (DMV) ile Canlı Performans İzleme</w:t>
+            </w:r>
+            <w:r>
+              <w:rPr>
+                <w:noProof/>
+                <w:webHidden/>
+              </w:rPr>
+              <w:tab/>
+            </w:r>
+            <w:r>
+              <w:rPr>
+                <w:noProof/>
+                <w:webHidden/>
+              </w:rPr>
+              <w:fldChar w:fldCharType="begin"/>
+            </w:r>
+            <w:r>
+              <w:rPr>
+                <w:noProof/>
+                <w:webHidden/>
+              </w:rPr>
+              <w:instrText xml:space="preserve"> PAGEREF _Toc231228829 \h </w:instrText>
+            </w:r>
+            <w:r>
+              <w:rPr>
+                <w:noProof/>
+                <w:webHidden/>
+              </w:rPr>
+            </w:r>
+            <w:r>
+              <w:rPr>
+                <w:noProof/>
+                <w:webHidden/>
+              </w:rPr>
+              <w:fldChar w:fldCharType="separate"/>
+            </w:r>
+            <w:r>
+              <w:rPr>
+                <w:noProof/>
+                <w:webHidden/>
+              </w:rPr>
+              <w:t>5</w:t>
             </w:r>
             <w:r>
               <w:rPr>
@@ -644,7 +786,7 @@
           <w:color w:val="000000" w:themeColor="text1"/>
         </w:rPr>
       </w:pPr>
-      <w:bookmarkStart w:id="0" w:name="_Toc231228142"/>
+      <w:bookmarkStart w:id="0" w:name="_Toc231228825"/>
       <w:r>
         <w:rPr>
           <w:b/>
@@ -699,7 +841,7 @@
       <w:pPr>
         <w:pStyle w:val="Balk2"/>
       </w:pPr>
-      <w:bookmarkStart w:id="1" w:name="_Toc231228143"/>
+      <w:bookmarkStart w:id="1" w:name="_Toc231228826"/>
       <w:r>
         <w:t xml:space="preserve">ADIM 1: </w:t>
       </w:r>
@@ -986,7 +1128,7 @@
       <w:pPr>
         <w:pStyle w:val="Balk2"/>
       </w:pPr>
-      <w:bookmarkStart w:id="2" w:name="_Toc231228144"/>
+      <w:bookmarkStart w:id="2" w:name="_Toc231228827"/>
       <w:r>
         <w:t xml:space="preserve">ADIM </w:t>
       </w:r>
@@ -1229,9 +1371,11 @@
       <w:pPr>
         <w:pStyle w:val="Balk2"/>
       </w:pPr>
+      <w:bookmarkStart w:id="3" w:name="_Toc231228828"/>
       <w:r>
         <w:t>ADIM 3: İndeks Yapılandırması ve Performans Optimizasyonu</w:t>
       </w:r>
+      <w:bookmarkEnd w:id="3"/>
     </w:p>
     <w:p>
       <w:r>
@@ -1389,6 +1533,9 @@
     </w:p>
     <w:p>
       <w:r>
+        <w:rPr>
+          <w:noProof/>
+        </w:rPr>
         <w:drawing>
           <wp:inline distT="0" distB="0" distL="0" distR="0" wp14:anchorId="25CA2368" wp14:editId="322F1249">
             <wp:extent cx="5760720" cy="1165860"/>
@@ -1428,6 +1575,177 @@
     </w:p>
     <w:p/>
     <w:p/>
+    <w:p>
+      <w:r>
+        <w:t>01.06.2026</w:t>
+      </w:r>
+    </w:p>
+    <w:p>
+      <w:pPr>
+        <w:pStyle w:val="Balk2"/>
+      </w:pPr>
+      <w:bookmarkStart w:id="4" w:name="_Toc231228829"/>
+      <w:r>
+        <w:t xml:space="preserve">ADIM 4: </w:t>
+      </w:r>
+      <w:proofErr w:type="spellStart"/>
+      <w:r>
+        <w:t>Dynamic</w:t>
+      </w:r>
+      <w:proofErr w:type="spellEnd"/>
+      <w:r>
+        <w:t xml:space="preserve"> Management </w:t>
+      </w:r>
+      <w:proofErr w:type="spellStart"/>
+      <w:r>
+        <w:t>Views</w:t>
+      </w:r>
+      <w:proofErr w:type="spellEnd"/>
+      <w:r>
+        <w:t xml:space="preserve"> (DMV) ile Canlı Performans İzleme</w:t>
+      </w:r>
+      <w:bookmarkEnd w:id="4"/>
+    </w:p>
+    <w:p>
+      <w:r>
+        <w:t xml:space="preserve">Proje yönergesinde yer alan </w:t>
+      </w:r>
+      <w:proofErr w:type="spellStart"/>
+      <w:r>
+        <w:t>veritabanı</w:t>
+      </w:r>
+      <w:proofErr w:type="spellEnd"/>
+      <w:r>
+        <w:t xml:space="preserve"> izleme ve hataları tespit etme maddesi</w:t>
+      </w:r>
+      <w:r>
+        <w:t xml:space="preserve">ni tamamlamak </w:t>
+      </w:r>
+      <w:proofErr w:type="gramStart"/>
+      <w:r>
+        <w:t>amacıyla</w:t>
+      </w:r>
+      <w:r>
+        <w:t xml:space="preserve"> ,</w:t>
+      </w:r>
+      <w:proofErr w:type="gramEnd"/>
+      <w:r>
+        <w:t xml:space="preserve"> SQL Server'ın yerleşik sistem görünümleri olan </w:t>
+      </w:r>
+      <w:proofErr w:type="spellStart"/>
+      <w:r>
+        <w:t>sys.dm_exec_query_stats</w:t>
+      </w:r>
+      <w:proofErr w:type="spellEnd"/>
+      <w:r>
+        <w:t xml:space="preserve"> ve </w:t>
+      </w:r>
+      <w:proofErr w:type="spellStart"/>
+      <w:r>
+        <w:t>sys.dm_exec_sql_text</w:t>
+      </w:r>
+      <w:proofErr w:type="spellEnd"/>
+      <w:r>
+        <w:t xml:space="preserve"> DMV yapıları kullanılmıştır. Yazılan özel analitik sorgu sayesinde, </w:t>
+      </w:r>
+      <w:proofErr w:type="spellStart"/>
+      <w:r>
+        <w:t>veritabanı</w:t>
+      </w:r>
+      <w:proofErr w:type="spellEnd"/>
+      <w:r>
+        <w:t xml:space="preserve"> motorunun hafızasındaki (</w:t>
+      </w:r>
+      <w:proofErr w:type="spellStart"/>
+      <w:r>
+        <w:t>cache</w:t>
+      </w:r>
+      <w:proofErr w:type="spellEnd"/>
+      <w:r>
+        <w:t xml:space="preserve">) en yüksek CPU maliyetine sahip dinamik sorgular listelenmiştir. </w:t>
+      </w:r>
+    </w:p>
+    <w:p>
+      <w:r>
+        <w:rPr>
+          <w:b/>
+          <w:bCs/>
+        </w:rPr>
+        <w:t>İzleme Bulguları:</w:t>
+      </w:r>
+    </w:p>
+    <w:p>
+      <w:pPr>
+        <w:numPr>
+          <w:ilvl w:val="0"/>
+          <w:numId w:val="3"/>
+        </w:numPr>
+      </w:pPr>
+      <w:r>
+        <w:t>Canlı izleme sonucunda, önceki adımlarda test ettiğimiz ağır sorguların işlemciyi ne kadar süre kilitlediği ve kaç kez tetiklendiği milisaniye (</w:t>
+      </w:r>
+      <w:proofErr w:type="spellStart"/>
+      <w:r>
+        <w:t>ms</w:t>
+      </w:r>
+      <w:proofErr w:type="spellEnd"/>
+      <w:r>
+        <w:t>) bazında başarıyla raporlanmıştır.</w:t>
+      </w:r>
+    </w:p>
+    <w:p>
+      <w:pPr>
+        <w:numPr>
+          <w:ilvl w:val="0"/>
+          <w:numId w:val="3"/>
+        </w:numPr>
+      </w:pPr>
+      <w:r>
+        <w:t>Bu yöntem sayesinde, arayüz araçlarına bağımlı kalmadan doğrudan kod tabanlı performans denetimi ve sistem optimizasyon takibi gerçekleştirilmiştir.</w:t>
+      </w:r>
+    </w:p>
+    <w:p>
+      <w:r>
+        <w:lastRenderedPageBreak/>
+        <w:drawing>
+          <wp:inline distT="0" distB="0" distL="0" distR="0" wp14:anchorId="4023528E" wp14:editId="7007CB70">
+            <wp:extent cx="5760720" cy="1032510"/>
+            <wp:effectExtent l="0" t="0" r="0" b="0"/>
+            <wp:docPr id="1308755568" name="Resim 1" descr="metin, yazı tipi, çizgi, sayı, numara içeren bir resim&#10;&#10;Yapay zeka tarafından oluşturulmuş içerik yanlış olabilir."/>
+            <wp:cNvGraphicFramePr>
+              <a:graphicFrameLocks xmlns:a="http://schemas.openxmlformats.org/drawingml/2006/main" noChangeAspect="1"/>
+            </wp:cNvGraphicFramePr>
+            <a:graphic xmlns:a="http://schemas.openxmlformats.org/drawingml/2006/main">
+              <a:graphicData uri="http://schemas.openxmlformats.org/drawingml/2006/picture">
+                <pic:pic xmlns:pic="http://schemas.openxmlformats.org/drawingml/2006/picture">
+                  <pic:nvPicPr>
+                    <pic:cNvPr id="1308755568" name="Resim 1" descr="metin, yazı tipi, çizgi, sayı, numara içeren bir resim&#10;&#10;Yapay zeka tarafından oluşturulmuş içerik yanlış olabilir."/>
+                    <pic:cNvPicPr/>
+                  </pic:nvPicPr>
+                  <pic:blipFill>
+                    <a:blip r:embed="rId9"/>
+                    <a:stretch>
+                      <a:fillRect/>
+                    </a:stretch>
+                  </pic:blipFill>
+                  <pic:spPr>
+                    <a:xfrm>
+                      <a:off x="0" y="0"/>
+                      <a:ext cx="5760720" cy="1032510"/>
+                    </a:xfrm>
+                    <a:prstGeom prst="rect">
+                      <a:avLst/>
+                    </a:prstGeom>
+                  </pic:spPr>
+                </pic:pic>
+              </a:graphicData>
+            </a:graphic>
+          </wp:inline>
+        </w:drawing>
+      </w:r>
+    </w:p>
+    <w:p/>
+    <w:p/>
     <w:sectPr>
       <w:pgSz w:w="11906" w:h="16838"/>
       <w:pgMar w:top="1417" w:right="1417" w:bottom="1417" w:left="1417" w:header="708" w:footer="708" w:gutter="0"/>
@@ -1441,9 +1759,9 @@
 <file path=word/numbering.xml><?xml version="1.0" encoding="utf-8"?>
 <w:numbering xmlns:wpc="http://schemas.microsoft.com/office/word/2010/wordprocessingCanvas" xmlns:cx="http://schemas.microsoft.com/office/drawing/2014/chartex" xmlns:cx1="http://schemas.microsoft.com/office/drawing/2015/9/8/chartex" xmlns:cx2="http://schemas.microsoft.com/office/drawing/2015/10/21/chartex" xmlns:cx3="http://schemas.microsoft.com/office/drawing/2016/5/9/chartex" xmlns:cx4="http://schemas.microsoft.com/office/drawing/2016/5/10/chartex" xmlns:cx5="http://schemas.microsoft.com/office/drawing/2016/5/11/chartex" xmlns:cx6="http://schemas.microsoft.com/office/drawing/2016/5/12/chartex" xmlns:cx7="http://schemas.microsoft.com/office/drawing/2016/5/13/chartex" xmlns:cx8="http://schemas.microsoft.com/office/drawing/2016/5/14/chartex" xmlns:mc="http://schemas.openxmlformats.org/markup-compatibility/2006" xmlns:aink="http://schemas.microsoft.com/office/drawing/2016/ink" xmlns:am3d="http://schemas.microsoft.com/office/drawing/2017/model3d" xmlns:o="urn:schemas-microsoft-com:office:office" xmlns:oel="http://schemas.microsoft.com/office/2019/extlst" xmlns:r="http://schemas.openxmlformats.org/officeDocument/2006/relationships" xmlns:m="http://schemas.openxmlformats.org/officeDocument/2006/math" xmlns:v="urn:schemas-microsoft-com:vml" xmlns:wp14="http://schemas.microsoft.com/office/word/2010/wordprocessingDrawing" xmlns:wp="http://schemas.openxmlformats.org/drawingml/2006/wordprocessingDrawing" xmlns:w10="urn:schemas-microsoft-com:office:word" xmlns:w="http://schemas.openxmlformats.org/wordprocessingml/2006/main" xmlns:w14="http://schemas.microsoft.com/office/word/2010/wordml" xmlns:w15="http://schemas.microsoft.com/office/word/2012/wordml" xmlns:w16cex="http://schemas.microsoft.com/office/word/2018/wordml/cex" xmlns:w16cid="http://schemas.microsoft.com/office/word/2016/wordml/cid" xmlns:w16="http://schemas.microsoft.com/office/word/2018/wordml" xmlns:w16du="http://schemas.microsoft.com/office/word/2023/wordml/word16du" xmlns:w16sdtdh="http://schemas.microsoft.com/office/word/2020/wordml/sdtdatahash" xmlns:w16sdtfl="http://schemas.microsoft.com/office/word/2024/wordml/sdtformatlock" xmlns:w16se="http://schemas.microsoft.com/office/word/2015/wordml/symex" xmlns:wpg="http://schemas.microsoft.com/office/word/2010/wordprocessingGroup" xmlns:wpi="http://schemas.microsoft.com/office/word/2010/wordprocessingInk" xmlns:wne="http://schemas.microsoft.com/office/word/2006/wordml" xmlns:wps="http://schemas.microsoft.com/office/word/2010/wordprocessingShape" mc:Ignorable="w14 w15 w16se w16cid w16 w16cex w16sdtdh w16sdtfl w16du wp14">
   <w:abstractNum w:abstractNumId="0" w15:restartNumberingAfterBreak="0">
-    <w:nsid w:val="30C24743"/>
+    <w:nsid w:val="15CE3CF0"/>
     <w:multiLevelType w:val="multilevel"/>
-    <w:tmpl w:val="1A7C491A"/>
+    <w:tmpl w:val="EAC89F9C"/>
     <w:lvl w:ilvl="0">
       <w:start w:val="1"/>
       <w:numFmt w:val="bullet"/>
@@ -1590,6 +1908,155 @@
     </w:lvl>
   </w:abstractNum>
   <w:abstractNum w:abstractNumId="1" w15:restartNumberingAfterBreak="0">
+    <w:nsid w:val="30C24743"/>
+    <w:multiLevelType w:val="multilevel"/>
+    <w:tmpl w:val="1A7C491A"/>
+    <w:lvl w:ilvl="0">
+      <w:start w:val="1"/>
+      <w:numFmt w:val="bullet"/>
+      <w:lvlText w:val=""/>
+      <w:lvlJc w:val="left"/>
+      <w:pPr>
+        <w:tabs>
+          <w:tab w:val="num" w:pos="720"/>
+        </w:tabs>
+        <w:ind w:left="720" w:hanging="360"/>
+      </w:pPr>
+      <w:rPr>
+        <w:rFonts w:ascii="Symbol" w:hAnsi="Symbol" w:hint="default"/>
+        <w:sz w:val="20"/>
+      </w:rPr>
+    </w:lvl>
+    <w:lvl w:ilvl="1" w:tentative="1">
+      <w:start w:val="1"/>
+      <w:numFmt w:val="bullet"/>
+      <w:lvlText w:val="o"/>
+      <w:lvlJc w:val="left"/>
+      <w:pPr>
+        <w:tabs>
+          <w:tab w:val="num" w:pos="1440"/>
+        </w:tabs>
+        <w:ind w:left="1440" w:hanging="360"/>
+      </w:pPr>
+      <w:rPr>
+        <w:rFonts w:ascii="Courier New" w:hAnsi="Courier New" w:hint="default"/>
+        <w:sz w:val="20"/>
+      </w:rPr>
+    </w:lvl>
+    <w:lvl w:ilvl="2" w:tentative="1">
+      <w:start w:val="1"/>
+      <w:numFmt w:val="bullet"/>
+      <w:lvlText w:val=""/>
+      <w:lvlJc w:val="left"/>
+      <w:pPr>
+        <w:tabs>
+          <w:tab w:val="num" w:pos="2160"/>
+        </w:tabs>
+        <w:ind w:left="2160" w:hanging="360"/>
+      </w:pPr>
+      <w:rPr>
+        <w:rFonts w:ascii="Wingdings" w:hAnsi="Wingdings" w:hint="default"/>
+        <w:sz w:val="20"/>
+      </w:rPr>
+    </w:lvl>
+    <w:lvl w:ilvl="3" w:tentative="1">
+      <w:start w:val="1"/>
+      <w:numFmt w:val="bullet"/>
+      <w:lvlText w:val=""/>
+      <w:lvlJc w:val="left"/>
+      <w:pPr>
+        <w:tabs>
+          <w:tab w:val="num" w:pos="2880"/>
+        </w:tabs>
+        <w:ind w:left="2880" w:hanging="360"/>
+      </w:pPr>
+      <w:rPr>
+        <w:rFonts w:ascii="Wingdings" w:hAnsi="Wingdings" w:hint="default"/>
+        <w:sz w:val="20"/>
+      </w:rPr>
+    </w:lvl>
+    <w:lvl w:ilvl="4" w:tentative="1">
+      <w:start w:val="1"/>
+      <w:numFmt w:val="bullet"/>
+      <w:lvlText w:val=""/>
+      <w:lvlJc w:val="left"/>
+      <w:pPr>
+        <w:tabs>
+          <w:tab w:val="num" w:pos="3600"/>
+        </w:tabs>
+        <w:ind w:left="3600" w:hanging="360"/>
+      </w:pPr>
+      <w:rPr>
+        <w:rFonts w:ascii="Wingdings" w:hAnsi="Wingdings" w:hint="default"/>
+        <w:sz w:val="20"/>
+      </w:rPr>
+    </w:lvl>
+    <w:lvl w:ilvl="5" w:tentative="1">
+      <w:start w:val="1"/>
+      <w:numFmt w:val="bullet"/>
+      <w:lvlText w:val=""/>
+      <w:lvlJc w:val="left"/>
+      <w:pPr>
+        <w:tabs>
+          <w:tab w:val="num" w:pos="4320"/>
+        </w:tabs>
+        <w:ind w:left="4320" w:hanging="360"/>
+      </w:pPr>
+      <w:rPr>
+        <w:rFonts w:ascii="Wingdings" w:hAnsi="Wingdings" w:hint="default"/>
+        <w:sz w:val="20"/>
+      </w:rPr>
+    </w:lvl>
+    <w:lvl w:ilvl="6" w:tentative="1">
+      <w:start w:val="1"/>
+      <w:numFmt w:val="bullet"/>
+      <w:lvlText w:val=""/>
+      <w:lvlJc w:val="left"/>
+      <w:pPr>
+        <w:tabs>
+          <w:tab w:val="num" w:pos="5040"/>
+        </w:tabs>
+        <w:ind w:left="5040" w:hanging="360"/>
+      </w:pPr>
+      <w:rPr>
+        <w:rFonts w:ascii="Wingdings" w:hAnsi="Wingdings" w:hint="default"/>
+        <w:sz w:val="20"/>
+      </w:rPr>
+    </w:lvl>
+    <w:lvl w:ilvl="7" w:tentative="1">
+      <w:start w:val="1"/>
+      <w:numFmt w:val="bullet"/>
+      <w:lvlText w:val=""/>
+      <w:lvlJc w:val="left"/>
+      <w:pPr>
+        <w:tabs>
+          <w:tab w:val="num" w:pos="5760"/>
+        </w:tabs>
+        <w:ind w:left="5760" w:hanging="360"/>
+      </w:pPr>
+      <w:rPr>
+        <w:rFonts w:ascii="Wingdings" w:hAnsi="Wingdings" w:hint="default"/>
+        <w:sz w:val="20"/>
+      </w:rPr>
+    </w:lvl>
+    <w:lvl w:ilvl="8" w:tentative="1">
+      <w:start w:val="1"/>
+      <w:numFmt w:val="bullet"/>
+      <w:lvlText w:val=""/>
+      <w:lvlJc w:val="left"/>
+      <w:pPr>
+        <w:tabs>
+          <w:tab w:val="num" w:pos="6480"/>
+        </w:tabs>
+        <w:ind w:left="6480" w:hanging="360"/>
+      </w:pPr>
+      <w:rPr>
+        <w:rFonts w:ascii="Wingdings" w:hAnsi="Wingdings" w:hint="default"/>
+        <w:sz w:val="20"/>
+      </w:rPr>
+    </w:lvl>
+  </w:abstractNum>
+  <w:abstractNum w:abstractNumId="2" w15:restartNumberingAfterBreak="0">
     <w:nsid w:val="69DD104A"/>
     <w:multiLevelType w:val="multilevel"/>
     <w:tmpl w:val="31AE70C4"/>
@@ -1703,9 +2170,12 @@
     </w:lvl>
   </w:abstractNum>
   <w:num w:numId="1" w16cid:durableId="1283733942">
+    <w:abstractNumId w:val="2"/>
+  </w:num>
+  <w:num w:numId="2" w16cid:durableId="1760246595">
     <w:abstractNumId w:val="1"/>
   </w:num>
-  <w:num w:numId="2" w16cid:durableId="1760246595">
+  <w:num w:numId="3" w16cid:durableId="1168062593">
     <w:abstractNumId w:val="0"/>
   </w:num>
 </w:numbering>

</xml_diff>

<commit_message>
Proje 1: Veri yöneticisi rolleri ve erişim yönetimi yapılandırıldı
</commit_message>
<xml_diff>
--- a/BLM4522_Proje1/Proje1_Rapor.docx
+++ b/BLM4522_Proje1/Proje1_Rapor.docx
@@ -1706,6 +1706,9 @@
     </w:p>
     <w:p>
       <w:r>
+        <w:rPr>
+          <w:noProof/>
+        </w:rPr>
         <w:lastRenderedPageBreak/>
         <w:drawing>
           <wp:inline distT="0" distB="0" distL="0" distR="0" wp14:anchorId="4023528E" wp14:editId="7007CB70">
@@ -1745,6 +1748,77 @@
       </w:r>
     </w:p>
     <w:p/>
+    <w:p>
+      <w:r>
+        <w:t>01.06.2026</w:t>
+      </w:r>
+    </w:p>
+    <w:p>
+      <w:pPr>
+        <w:pStyle w:val="Balk2"/>
+      </w:pPr>
+      <w:r>
+        <w:t>ADIM 5: Veri Yöneticisi Rolleri ve Erişim Yönetimi</w:t>
+      </w:r>
+    </w:p>
+    <w:p>
+      <w:r>
+        <w:t xml:space="preserve">Proje gereksinimlerinde istenen farklı roller için erişim denetimini sağlamak amacıyla </w:t>
+      </w:r>
+      <w:proofErr w:type="spellStart"/>
+      <w:r>
+        <w:t>veritabanında</w:t>
+      </w:r>
+      <w:proofErr w:type="spellEnd"/>
+      <w:r>
+        <w:t xml:space="preserve"> yeni bir kullanıcı hesabı tanımlanmıştır. İlk olarak sunucu genelinde </w:t>
+      </w:r>
+      <w:proofErr w:type="spellStart"/>
+      <w:r>
+        <w:t>DenetleyiciLogin</w:t>
+      </w:r>
+      <w:proofErr w:type="spellEnd"/>
+      <w:r>
+        <w:t xml:space="preserve"> adında bir giriş kimliği oluşturulmuş ve bu kimlik AdventureWorks2019 </w:t>
+      </w:r>
+      <w:proofErr w:type="spellStart"/>
+      <w:r>
+        <w:t>veritabanı</w:t>
+      </w:r>
+      <w:proofErr w:type="spellEnd"/>
+      <w:r>
+        <w:t xml:space="preserve"> içindeki </w:t>
+      </w:r>
+      <w:proofErr w:type="spellStart"/>
+      <w:r>
+        <w:t>DenetleyiciUser</w:t>
+      </w:r>
+      <w:proofErr w:type="spellEnd"/>
+      <w:r>
+        <w:t xml:space="preserve"> kullanıcısıyla eşleştirilmiştir.</w:t>
+      </w:r>
+    </w:p>
+    <w:p>
+      <w:r>
+        <w:t xml:space="preserve">Bu kullanıcının </w:t>
+      </w:r>
+      <w:proofErr w:type="spellStart"/>
+      <w:r>
+        <w:t>veritabanındaki</w:t>
+      </w:r>
+      <w:proofErr w:type="spellEnd"/>
+      <w:r>
+        <w:t xml:space="preserve"> tablolara veya mevcut indeks yapılarına zarar vermesini önlemek ve sadece performans izlemesi yapabilmesini sağlamak için kendisine yalnızca </w:t>
+      </w:r>
+      <w:proofErr w:type="spellStart"/>
+      <w:r>
+        <w:t>db_datareader</w:t>
+      </w:r>
+      <w:proofErr w:type="spellEnd"/>
+      <w:r>
+        <w:t xml:space="preserve"> (Veri Okuyucu) rolü atanmıştır. Böylece sistemde veri silme veya değiştirme yetkisi olmayan, sadece okuma ve raporlama yapabilecek kısıtlı bir kullanıcı hesabı hazırlanmıştır.</w:t>
+      </w:r>
+    </w:p>
     <w:p/>
     <w:sectPr>
       <w:pgSz w:w="11906" w:h="16838"/>

</xml_diff>

<commit_message>
Proje 1: Disk alanı yönetimi sorgusu ve analiz raporu eklendi
</commit_message>
<xml_diff>
--- a/BLM4522_Proje1/Proje1_Rapor.docx
+++ b/BLM4522_Proje1/Proje1_Rapor.docx
@@ -400,7 +400,7 @@
           <w:r>
             <w:fldChar w:fldCharType="separate"/>
           </w:r>
-          <w:hyperlink w:anchor="_Toc231228825" w:history="1">
+          <w:hyperlink w:anchor="_Toc231229962" w:history="1">
             <w:r>
               <w:rPr>
                 <w:rStyle w:val="Kpr"/>
@@ -428,7 +428,7 @@
                 <w:noProof/>
                 <w:webHidden/>
               </w:rPr>
-              <w:instrText xml:space="preserve"> PAGEREF _Toc231228825 \h </w:instrText>
+              <w:instrText xml:space="preserve"> PAGEREF _Toc231229962 \h </w:instrText>
             </w:r>
             <w:r>
               <w:rPr>
@@ -472,7 +472,7 @@
               <w14:ligatures w14:val="standardContextual"/>
             </w:rPr>
           </w:pPr>
-          <w:hyperlink w:anchor="_Toc231228826" w:history="1">
+          <w:hyperlink w:anchor="_Toc231229963" w:history="1">
             <w:r>
               <w:rPr>
                 <w:rStyle w:val="Kpr"/>
@@ -499,7 +499,7 @@
                 <w:noProof/>
                 <w:webHidden/>
               </w:rPr>
-              <w:instrText xml:space="preserve"> PAGEREF _Toc231228826 \h </w:instrText>
+              <w:instrText xml:space="preserve"> PAGEREF _Toc231229963 \h </w:instrText>
             </w:r>
             <w:r>
               <w:rPr>
@@ -543,7 +543,7 @@
               <w14:ligatures w14:val="standardContextual"/>
             </w:rPr>
           </w:pPr>
-          <w:hyperlink w:anchor="_Toc231228827" w:history="1">
+          <w:hyperlink w:anchor="_Toc231229964" w:history="1">
             <w:r>
               <w:rPr>
                 <w:rStyle w:val="Kpr"/>
@@ -570,7 +570,7 @@
                 <w:noProof/>
                 <w:webHidden/>
               </w:rPr>
-              <w:instrText xml:space="preserve"> PAGEREF _Toc231228827 \h </w:instrText>
+              <w:instrText xml:space="preserve"> PAGEREF _Toc231229964 \h </w:instrText>
             </w:r>
             <w:r>
               <w:rPr>
@@ -614,7 +614,7 @@
               <w14:ligatures w14:val="standardContextual"/>
             </w:rPr>
           </w:pPr>
-          <w:hyperlink w:anchor="_Toc231228828" w:history="1">
+          <w:hyperlink w:anchor="_Toc231229965" w:history="1">
             <w:r>
               <w:rPr>
                 <w:rStyle w:val="Kpr"/>
@@ -641,7 +641,7 @@
                 <w:noProof/>
                 <w:webHidden/>
               </w:rPr>
-              <w:instrText xml:space="preserve"> PAGEREF _Toc231228828 \h </w:instrText>
+              <w:instrText xml:space="preserve"> PAGEREF _Toc231229965 \h </w:instrText>
             </w:r>
             <w:r>
               <w:rPr>
@@ -661,7 +661,7 @@
                 <w:noProof/>
                 <w:webHidden/>
               </w:rPr>
-              <w:t>4</w:t>
+              <w:t>5</w:t>
             </w:r>
             <w:r>
               <w:rPr>
@@ -685,7 +685,7 @@
               <w14:ligatures w14:val="standardContextual"/>
             </w:rPr>
           </w:pPr>
-          <w:hyperlink w:anchor="_Toc231228829" w:history="1">
+          <w:hyperlink w:anchor="_Toc231229966" w:history="1">
             <w:r>
               <w:rPr>
                 <w:rStyle w:val="Kpr"/>
@@ -712,7 +712,7 @@
                 <w:noProof/>
                 <w:webHidden/>
               </w:rPr>
-              <w:instrText xml:space="preserve"> PAGEREF _Toc231228829 \h </w:instrText>
+              <w:instrText xml:space="preserve"> PAGEREF _Toc231229966 \h </w:instrText>
             </w:r>
             <w:r>
               <w:rPr>
@@ -732,7 +732,149 @@
                 <w:noProof/>
                 <w:webHidden/>
               </w:rPr>
-              <w:t>5</w:t>
+              <w:t>6</w:t>
+            </w:r>
+            <w:r>
+              <w:rPr>
+                <w:noProof/>
+                <w:webHidden/>
+              </w:rPr>
+              <w:fldChar w:fldCharType="end"/>
+            </w:r>
+          </w:hyperlink>
+        </w:p>
+        <w:p>
+          <w:pPr>
+            <w:pStyle w:val="T2"/>
+            <w:rPr>
+              <w:rFonts w:asciiTheme="minorHAnsi" w:eastAsiaTheme="minorEastAsia" w:hAnsiTheme="minorHAnsi" w:cstheme="minorBidi"/>
+              <w:b w:val="0"/>
+              <w:noProof/>
+              <w:kern w:val="2"/>
+              <w:u w:val="none"/>
+              <w:lang w:eastAsia="tr-TR"/>
+              <w14:ligatures w14:val="standardContextual"/>
+            </w:rPr>
+          </w:pPr>
+          <w:hyperlink w:anchor="_Toc231229967" w:history="1">
+            <w:r>
+              <w:rPr>
+                <w:rStyle w:val="Kpr"/>
+                <w:noProof/>
+              </w:rPr>
+              <w:t>ADIM 5: Veri Yöneticisi Rolleri ve Erişim Yönetimi</w:t>
+            </w:r>
+            <w:r>
+              <w:rPr>
+                <w:noProof/>
+                <w:webHidden/>
+              </w:rPr>
+              <w:tab/>
+            </w:r>
+            <w:r>
+              <w:rPr>
+                <w:noProof/>
+                <w:webHidden/>
+              </w:rPr>
+              <w:fldChar w:fldCharType="begin"/>
+            </w:r>
+            <w:r>
+              <w:rPr>
+                <w:noProof/>
+                <w:webHidden/>
+              </w:rPr>
+              <w:instrText xml:space="preserve"> PAGEREF _Toc231229967 \h </w:instrText>
+            </w:r>
+            <w:r>
+              <w:rPr>
+                <w:noProof/>
+                <w:webHidden/>
+              </w:rPr>
+            </w:r>
+            <w:r>
+              <w:rPr>
+                <w:noProof/>
+                <w:webHidden/>
+              </w:rPr>
+              <w:fldChar w:fldCharType="separate"/>
+            </w:r>
+            <w:r>
+              <w:rPr>
+                <w:noProof/>
+                <w:webHidden/>
+              </w:rPr>
+              <w:t>7</w:t>
+            </w:r>
+            <w:r>
+              <w:rPr>
+                <w:noProof/>
+                <w:webHidden/>
+              </w:rPr>
+              <w:fldChar w:fldCharType="end"/>
+            </w:r>
+          </w:hyperlink>
+        </w:p>
+        <w:p>
+          <w:pPr>
+            <w:pStyle w:val="T2"/>
+            <w:rPr>
+              <w:rFonts w:asciiTheme="minorHAnsi" w:eastAsiaTheme="minorEastAsia" w:hAnsiTheme="minorHAnsi" w:cstheme="minorBidi"/>
+              <w:b w:val="0"/>
+              <w:noProof/>
+              <w:kern w:val="2"/>
+              <w:u w:val="none"/>
+              <w:lang w:eastAsia="tr-TR"/>
+              <w14:ligatures w14:val="standardContextual"/>
+            </w:rPr>
+          </w:pPr>
+          <w:hyperlink w:anchor="_Toc231229968" w:history="1">
+            <w:r>
+              <w:rPr>
+                <w:rStyle w:val="Kpr"/>
+                <w:noProof/>
+              </w:rPr>
+              <w:t>ADIM 6: Disk Alanı Yönetimi ve Takibi</w:t>
+            </w:r>
+            <w:r>
+              <w:rPr>
+                <w:noProof/>
+                <w:webHidden/>
+              </w:rPr>
+              <w:tab/>
+            </w:r>
+            <w:r>
+              <w:rPr>
+                <w:noProof/>
+                <w:webHidden/>
+              </w:rPr>
+              <w:fldChar w:fldCharType="begin"/>
+            </w:r>
+            <w:r>
+              <w:rPr>
+                <w:noProof/>
+                <w:webHidden/>
+              </w:rPr>
+              <w:instrText xml:space="preserve"> PAGEREF _Toc231229968 \h </w:instrText>
+            </w:r>
+            <w:r>
+              <w:rPr>
+                <w:noProof/>
+                <w:webHidden/>
+              </w:rPr>
+            </w:r>
+            <w:r>
+              <w:rPr>
+                <w:noProof/>
+                <w:webHidden/>
+              </w:rPr>
+              <w:fldChar w:fldCharType="separate"/>
+            </w:r>
+            <w:r>
+              <w:rPr>
+                <w:noProof/>
+                <w:webHidden/>
+              </w:rPr>
+              <w:t>7</w:t>
             </w:r>
             <w:r>
               <w:rPr>
@@ -786,14 +928,13 @@
           <w:color w:val="000000" w:themeColor="text1"/>
         </w:rPr>
       </w:pPr>
-      <w:bookmarkStart w:id="0" w:name="_Toc231228825"/>
+      <w:bookmarkStart w:id="0" w:name="_Toc231229962"/>
       <w:r>
         <w:rPr>
           <w:b/>
           <w:bCs/>
           <w:color w:val="000000" w:themeColor="text1"/>
         </w:rPr>
-        <w:lastRenderedPageBreak/>
         <w:t xml:space="preserve">Proje </w:t>
       </w:r>
       <w:r>
@@ -841,7 +982,7 @@
       <w:pPr>
         <w:pStyle w:val="Balk2"/>
       </w:pPr>
-      <w:bookmarkStart w:id="1" w:name="_Toc231228826"/>
+      <w:bookmarkStart w:id="1" w:name="_Toc231229963"/>
       <w:r>
         <w:t xml:space="preserve">ADIM 1: </w:t>
       </w:r>
@@ -1120,7 +1261,6 @@
     <w:p/>
     <w:p>
       <w:r>
-        <w:lastRenderedPageBreak/>
         <w:t>01.06.2026</w:t>
       </w:r>
     </w:p>
@@ -1128,7 +1268,7 @@
       <w:pPr>
         <w:pStyle w:val="Balk2"/>
       </w:pPr>
-      <w:bookmarkStart w:id="2" w:name="_Toc231228827"/>
+      <w:bookmarkStart w:id="2" w:name="_Toc231229964"/>
       <w:r>
         <w:t xml:space="preserve">ADIM </w:t>
       </w:r>
@@ -1362,6 +1502,12 @@
       </w:r>
     </w:p>
     <w:p/>
+    <w:p/>
+    <w:p/>
+    <w:p/>
+    <w:p/>
+    <w:p/>
+    <w:p/>
     <w:p>
       <w:r>
         <w:t>01.06.2026</w:t>
@@ -1371,7 +1517,7 @@
       <w:pPr>
         <w:pStyle w:val="Balk2"/>
       </w:pPr>
-      <w:bookmarkStart w:id="3" w:name="_Toc231228828"/>
+      <w:bookmarkStart w:id="3" w:name="_Toc231229965"/>
       <w:r>
         <w:t>ADIM 3: İndeks Yapılandırması ve Performans Optimizasyonu</w:t>
       </w:r>
@@ -1429,7 +1575,6 @@
           <w:b/>
           <w:bCs/>
         </w:rPr>
-        <w:lastRenderedPageBreak/>
         <w:t>Optimizasyon Sonrası Bulgular:</w:t>
       </w:r>
     </w:p>
@@ -1575,6 +1720,13 @@
     </w:p>
     <w:p/>
     <w:p/>
+    <w:p/>
+    <w:p/>
+    <w:p/>
+    <w:p/>
+    <w:p/>
+    <w:p/>
+    <w:p/>
     <w:p>
       <w:r>
         <w:t>01.06.2026</w:t>
@@ -1584,7 +1736,7 @@
       <w:pPr>
         <w:pStyle w:val="Balk2"/>
       </w:pPr>
-      <w:bookmarkStart w:id="4" w:name="_Toc231228829"/>
+      <w:bookmarkStart w:id="4" w:name="_Toc231229966"/>
       <w:r>
         <w:t xml:space="preserve">ADIM 4: </w:t>
       </w:r>
@@ -1709,7 +1861,6 @@
         <w:rPr>
           <w:noProof/>
         </w:rPr>
-        <w:lastRenderedPageBreak/>
         <w:drawing>
           <wp:inline distT="0" distB="0" distL="0" distR="0" wp14:anchorId="4023528E" wp14:editId="7007CB70">
             <wp:extent cx="5760720" cy="1032510"/>
@@ -1748,6 +1899,18 @@
       </w:r>
     </w:p>
     <w:p/>
+    <w:p/>
+    <w:p/>
+    <w:p/>
+    <w:p/>
+    <w:p/>
+    <w:p/>
+    <w:p/>
+    <w:p/>
+    <w:p/>
+    <w:p/>
+    <w:p/>
+    <w:p/>
     <w:p>
       <w:r>
         <w:t>01.06.2026</w:t>
@@ -1757,9 +1920,11 @@
       <w:pPr>
         <w:pStyle w:val="Balk2"/>
       </w:pPr>
+      <w:bookmarkStart w:id="5" w:name="_Toc231229967"/>
       <w:r>
         <w:t>ADIM 5: Veri Yöneticisi Rolleri ve Erişim Yönetimi</w:t>
       </w:r>
+      <w:bookmarkEnd w:id="5"/>
     </w:p>
     <w:p>
       <w:r>
@@ -1819,6 +1984,140 @@
         <w:t xml:space="preserve"> (Veri Okuyucu) rolü atanmıştır. Böylece sistemde veri silme veya değiştirme yetkisi olmayan, sadece okuma ve raporlama yapabilecek kısıtlı bir kullanıcı hesabı hazırlanmıştır.</w:t>
       </w:r>
     </w:p>
+    <w:p/>
+    <w:p>
+      <w:r>
+        <w:t>01.06.2026</w:t>
+      </w:r>
+    </w:p>
+    <w:p>
+      <w:pPr>
+        <w:pStyle w:val="Balk2"/>
+      </w:pPr>
+      <w:bookmarkStart w:id="6" w:name="_Toc231229968"/>
+      <w:r>
+        <w:t>ADIM 6: Disk Alanı Yönetimi ve Takibi</w:t>
+      </w:r>
+      <w:bookmarkEnd w:id="6"/>
+    </w:p>
+    <w:p/>
+    <w:p>
+      <w:r>
+        <w:drawing>
+          <wp:inline distT="0" distB="0" distL="0" distR="0" wp14:anchorId="5E2A1A25" wp14:editId="193DB1B7">
+            <wp:extent cx="4861981" cy="807790"/>
+            <wp:effectExtent l="0" t="0" r="0" b="0"/>
+            <wp:docPr id="707918419" name="Resim 1" descr="metin, ekran görüntüsü, yazı tipi, çizgi içeren bir resim&#10;&#10;Yapay zeka tarafından oluşturulmuş içerik yanlış olabilir."/>
+            <wp:cNvGraphicFramePr>
+              <a:graphicFrameLocks xmlns:a="http://schemas.openxmlformats.org/drawingml/2006/main" noChangeAspect="1"/>
+            </wp:cNvGraphicFramePr>
+            <a:graphic xmlns:a="http://schemas.openxmlformats.org/drawingml/2006/main">
+              <a:graphicData uri="http://schemas.openxmlformats.org/drawingml/2006/picture">
+                <pic:pic xmlns:pic="http://schemas.openxmlformats.org/drawingml/2006/picture">
+                  <pic:nvPicPr>
+                    <pic:cNvPr id="707918419" name="Resim 1" descr="metin, ekran görüntüsü, yazı tipi, çizgi içeren bir resim&#10;&#10;Yapay zeka tarafından oluşturulmuş içerik yanlış olabilir."/>
+                    <pic:cNvPicPr/>
+                  </pic:nvPicPr>
+                  <pic:blipFill>
+                    <a:blip r:embed="rId10"/>
+                    <a:stretch>
+                      <a:fillRect/>
+                    </a:stretch>
+                  </pic:blipFill>
+                  <pic:spPr>
+                    <a:xfrm>
+                      <a:off x="0" y="0"/>
+                      <a:ext cx="4861981" cy="807790"/>
+                    </a:xfrm>
+                    <a:prstGeom prst="rect">
+                      <a:avLst/>
+                    </a:prstGeom>
+                  </pic:spPr>
+                </pic:pic>
+              </a:graphicData>
+            </a:graphic>
+          </wp:inline>
+        </w:drawing>
+      </w:r>
+    </w:p>
+    <w:p>
+      <w:r>
+        <w:t xml:space="preserve">Proje isterlerinde yer alan </w:t>
+      </w:r>
+      <w:proofErr w:type="spellStart"/>
+      <w:r>
+        <w:t>veritabanı</w:t>
+      </w:r>
+      <w:proofErr w:type="spellEnd"/>
+      <w:r>
+        <w:t xml:space="preserve"> disk alanı yönetimi kapsamında, AdventureWorks2019 </w:t>
+      </w:r>
+      <w:proofErr w:type="spellStart"/>
+      <w:r>
+        <w:t>veritabanına</w:t>
+      </w:r>
+      <w:proofErr w:type="spellEnd"/>
+      <w:r>
+        <w:t xml:space="preserve"> ait dosyaların disk üzerindeki boyutları ve doluluk oranları sorgulanarak incelenmiştir.</w:t>
+      </w:r>
+    </w:p>
+    <w:p>
+      <w:r>
+        <w:t>Disk Analizi Bulguları:</w:t>
+      </w:r>
+    </w:p>
+    <w:p>
+      <w:pPr>
+        <w:numPr>
+          <w:ilvl w:val="0"/>
+          <w:numId w:val="4"/>
+        </w:numPr>
+      </w:pPr>
+      <w:r>
+        <w:t xml:space="preserve">Veri Dosyası (ROWS): Tabloların ve asıl verilerin barındırıldığı ana </w:t>
+      </w:r>
+      <w:proofErr w:type="spellStart"/>
+      <w:r>
+        <w:t>veritabanı</w:t>
+      </w:r>
+      <w:proofErr w:type="spellEnd"/>
+      <w:r>
+        <w:t xml:space="preserve"> dosyasının toplam boyutu 264 MB olarak tespit edilmiştir. Bu alanın 205 MB'lık kısmının dolu, 58 MB'lık kısmının ise yeni veriler için boş olduğu gözlemlenmiştir.</w:t>
+      </w:r>
+    </w:p>
+    <w:p>
+      <w:pPr>
+        <w:numPr>
+          <w:ilvl w:val="0"/>
+          <w:numId w:val="4"/>
+        </w:numPr>
+      </w:pPr>
+      <w:r>
+        <w:t xml:space="preserve">Log Dosyası (LOG): </w:t>
+      </w:r>
+      <w:proofErr w:type="spellStart"/>
+      <w:r>
+        <w:t>Veritabanı</w:t>
+      </w:r>
+      <w:proofErr w:type="spellEnd"/>
+      <w:r>
+        <w:t xml:space="preserve"> işlem geçmişini tutan log dosyasının boyutu 72 MB olarak ölçülmüştür. Bu dosyanın ise yalnızca 12 MB'lık kısmının aktif olarak kullanıldığı belirlenmiştir.</w:t>
+      </w:r>
+    </w:p>
+    <w:p>
+      <w:r>
+        <w:t xml:space="preserve">Yapılan bu sorgulama sayesinde, </w:t>
+      </w:r>
+      <w:proofErr w:type="spellStart"/>
+      <w:r>
+        <w:t>veritabanının</w:t>
+      </w:r>
+      <w:proofErr w:type="spellEnd"/>
+      <w:r>
+        <w:t xml:space="preserve"> disk üzerinde kapladığı alan, veri yoğunluğu ve sistemde kalan boş yer miktarı dinamik olarak takip edilmektedir.</w:t>
+      </w:r>
+    </w:p>
+    <w:p/>
     <w:p/>
     <w:sectPr>
       <w:pgSz w:w="11906" w:h="16838"/>
@@ -1833,9 +2132,9 @@
 <file path=word/numbering.xml><?xml version="1.0" encoding="utf-8"?>
 <w:numbering xmlns:wpc="http://schemas.microsoft.com/office/word/2010/wordprocessingCanvas" xmlns:cx="http://schemas.microsoft.com/office/drawing/2014/chartex" xmlns:cx1="http://schemas.microsoft.com/office/drawing/2015/9/8/chartex" xmlns:cx2="http://schemas.microsoft.com/office/drawing/2015/10/21/chartex" xmlns:cx3="http://schemas.microsoft.com/office/drawing/2016/5/9/chartex" xmlns:cx4="http://schemas.microsoft.com/office/drawing/2016/5/10/chartex" xmlns:cx5="http://schemas.microsoft.com/office/drawing/2016/5/11/chartex" xmlns:cx6="http://schemas.microsoft.com/office/drawing/2016/5/12/chartex" xmlns:cx7="http://schemas.microsoft.com/office/drawing/2016/5/13/chartex" xmlns:cx8="http://schemas.microsoft.com/office/drawing/2016/5/14/chartex" xmlns:mc="http://schemas.openxmlformats.org/markup-compatibility/2006" xmlns:aink="http://schemas.microsoft.com/office/drawing/2016/ink" xmlns:am3d="http://schemas.microsoft.com/office/drawing/2017/model3d" xmlns:o="urn:schemas-microsoft-com:office:office" xmlns:oel="http://schemas.microsoft.com/office/2019/extlst" xmlns:r="http://schemas.openxmlformats.org/officeDocument/2006/relationships" xmlns:m="http://schemas.openxmlformats.org/officeDocument/2006/math" xmlns:v="urn:schemas-microsoft-com:vml" xmlns:wp14="http://schemas.microsoft.com/office/word/2010/wordprocessingDrawing" xmlns:wp="http://schemas.openxmlformats.org/drawingml/2006/wordprocessingDrawing" xmlns:w10="urn:schemas-microsoft-com:office:word" xmlns:w="http://schemas.openxmlformats.org/wordprocessingml/2006/main" xmlns:w14="http://schemas.microsoft.com/office/word/2010/wordml" xmlns:w15="http://schemas.microsoft.com/office/word/2012/wordml" xmlns:w16cex="http://schemas.microsoft.com/office/word/2018/wordml/cex" xmlns:w16cid="http://schemas.microsoft.com/office/word/2016/wordml/cid" xmlns:w16="http://schemas.microsoft.com/office/word/2018/wordml" xmlns:w16du="http://schemas.microsoft.com/office/word/2023/wordml/word16du" xmlns:w16sdtdh="http://schemas.microsoft.com/office/word/2020/wordml/sdtdatahash" xmlns:w16sdtfl="http://schemas.microsoft.com/office/word/2024/wordml/sdtformatlock" xmlns:w16se="http://schemas.microsoft.com/office/word/2015/wordml/symex" xmlns:wpg="http://schemas.microsoft.com/office/word/2010/wordprocessingGroup" xmlns:wpi="http://schemas.microsoft.com/office/word/2010/wordprocessingInk" xmlns:wne="http://schemas.microsoft.com/office/word/2006/wordml" xmlns:wps="http://schemas.microsoft.com/office/word/2010/wordprocessingShape" mc:Ignorable="w14 w15 w16se w16cid w16 w16cex w16sdtdh w16sdtfl w16du wp14">
   <w:abstractNum w:abstractNumId="0" w15:restartNumberingAfterBreak="0">
-    <w:nsid w:val="15CE3CF0"/>
+    <w:nsid w:val="11CE490E"/>
     <w:multiLevelType w:val="multilevel"/>
-    <w:tmpl w:val="EAC89F9C"/>
+    <w:tmpl w:val="DC3A2582"/>
     <w:lvl w:ilvl="0">
       <w:start w:val="1"/>
       <w:numFmt w:val="bullet"/>
@@ -1982,9 +2281,9 @@
     </w:lvl>
   </w:abstractNum>
   <w:abstractNum w:abstractNumId="1" w15:restartNumberingAfterBreak="0">
-    <w:nsid w:val="30C24743"/>
+    <w:nsid w:val="15CE3CF0"/>
     <w:multiLevelType w:val="multilevel"/>
-    <w:tmpl w:val="1A7C491A"/>
+    <w:tmpl w:val="EAC89F9C"/>
     <w:lvl w:ilvl="0">
       <w:start w:val="1"/>
       <w:numFmt w:val="bullet"/>
@@ -2131,6 +2430,155 @@
     </w:lvl>
   </w:abstractNum>
   <w:abstractNum w:abstractNumId="2" w15:restartNumberingAfterBreak="0">
+    <w:nsid w:val="30C24743"/>
+    <w:multiLevelType w:val="multilevel"/>
+    <w:tmpl w:val="1A7C491A"/>
+    <w:lvl w:ilvl="0">
+      <w:start w:val="1"/>
+      <w:numFmt w:val="bullet"/>
+      <w:lvlText w:val=""/>
+      <w:lvlJc w:val="left"/>
+      <w:pPr>
+        <w:tabs>
+          <w:tab w:val="num" w:pos="720"/>
+        </w:tabs>
+        <w:ind w:left="720" w:hanging="360"/>
+      </w:pPr>
+      <w:rPr>
+        <w:rFonts w:ascii="Symbol" w:hAnsi="Symbol" w:hint="default"/>
+        <w:sz w:val="20"/>
+      </w:rPr>
+    </w:lvl>
+    <w:lvl w:ilvl="1" w:tentative="1">
+      <w:start w:val="1"/>
+      <w:numFmt w:val="bullet"/>
+      <w:lvlText w:val="o"/>
+      <w:lvlJc w:val="left"/>
+      <w:pPr>
+        <w:tabs>
+          <w:tab w:val="num" w:pos="1440"/>
+        </w:tabs>
+        <w:ind w:left="1440" w:hanging="360"/>
+      </w:pPr>
+      <w:rPr>
+        <w:rFonts w:ascii="Courier New" w:hAnsi="Courier New" w:hint="default"/>
+        <w:sz w:val="20"/>
+      </w:rPr>
+    </w:lvl>
+    <w:lvl w:ilvl="2" w:tentative="1">
+      <w:start w:val="1"/>
+      <w:numFmt w:val="bullet"/>
+      <w:lvlText w:val=""/>
+      <w:lvlJc w:val="left"/>
+      <w:pPr>
+        <w:tabs>
+          <w:tab w:val="num" w:pos="2160"/>
+        </w:tabs>
+        <w:ind w:left="2160" w:hanging="360"/>
+      </w:pPr>
+      <w:rPr>
+        <w:rFonts w:ascii="Wingdings" w:hAnsi="Wingdings" w:hint="default"/>
+        <w:sz w:val="20"/>
+      </w:rPr>
+    </w:lvl>
+    <w:lvl w:ilvl="3" w:tentative="1">
+      <w:start w:val="1"/>
+      <w:numFmt w:val="bullet"/>
+      <w:lvlText w:val=""/>
+      <w:lvlJc w:val="left"/>
+      <w:pPr>
+        <w:tabs>
+          <w:tab w:val="num" w:pos="2880"/>
+        </w:tabs>
+        <w:ind w:left="2880" w:hanging="360"/>
+      </w:pPr>
+      <w:rPr>
+        <w:rFonts w:ascii="Wingdings" w:hAnsi="Wingdings" w:hint="default"/>
+        <w:sz w:val="20"/>
+      </w:rPr>
+    </w:lvl>
+    <w:lvl w:ilvl="4" w:tentative="1">
+      <w:start w:val="1"/>
+      <w:numFmt w:val="bullet"/>
+      <w:lvlText w:val=""/>
+      <w:lvlJc w:val="left"/>
+      <w:pPr>
+        <w:tabs>
+          <w:tab w:val="num" w:pos="3600"/>
+        </w:tabs>
+        <w:ind w:left="3600" w:hanging="360"/>
+      </w:pPr>
+      <w:rPr>
+        <w:rFonts w:ascii="Wingdings" w:hAnsi="Wingdings" w:hint="default"/>
+        <w:sz w:val="20"/>
+      </w:rPr>
+    </w:lvl>
+    <w:lvl w:ilvl="5" w:tentative="1">
+      <w:start w:val="1"/>
+      <w:numFmt w:val="bullet"/>
+      <w:lvlText w:val=""/>
+      <w:lvlJc w:val="left"/>
+      <w:pPr>
+        <w:tabs>
+          <w:tab w:val="num" w:pos="4320"/>
+        </w:tabs>
+        <w:ind w:left="4320" w:hanging="360"/>
+      </w:pPr>
+      <w:rPr>
+        <w:rFonts w:ascii="Wingdings" w:hAnsi="Wingdings" w:hint="default"/>
+        <w:sz w:val="20"/>
+      </w:rPr>
+    </w:lvl>
+    <w:lvl w:ilvl="6" w:tentative="1">
+      <w:start w:val="1"/>
+      <w:numFmt w:val="bullet"/>
+      <w:lvlText w:val=""/>
+      <w:lvlJc w:val="left"/>
+      <w:pPr>
+        <w:tabs>
+          <w:tab w:val="num" w:pos="5040"/>
+        </w:tabs>
+        <w:ind w:left="5040" w:hanging="360"/>
+      </w:pPr>
+      <w:rPr>
+        <w:rFonts w:ascii="Wingdings" w:hAnsi="Wingdings" w:hint="default"/>
+        <w:sz w:val="20"/>
+      </w:rPr>
+    </w:lvl>
+    <w:lvl w:ilvl="7" w:tentative="1">
+      <w:start w:val="1"/>
+      <w:numFmt w:val="bullet"/>
+      <w:lvlText w:val=""/>
+      <w:lvlJc w:val="left"/>
+      <w:pPr>
+        <w:tabs>
+          <w:tab w:val="num" w:pos="5760"/>
+        </w:tabs>
+        <w:ind w:left="5760" w:hanging="360"/>
+      </w:pPr>
+      <w:rPr>
+        <w:rFonts w:ascii="Wingdings" w:hAnsi="Wingdings" w:hint="default"/>
+        <w:sz w:val="20"/>
+      </w:rPr>
+    </w:lvl>
+    <w:lvl w:ilvl="8" w:tentative="1">
+      <w:start w:val="1"/>
+      <w:numFmt w:val="bullet"/>
+      <w:lvlText w:val=""/>
+      <w:lvlJc w:val="left"/>
+      <w:pPr>
+        <w:tabs>
+          <w:tab w:val="num" w:pos="6480"/>
+        </w:tabs>
+        <w:ind w:left="6480" w:hanging="360"/>
+      </w:pPr>
+      <w:rPr>
+        <w:rFonts w:ascii="Wingdings" w:hAnsi="Wingdings" w:hint="default"/>
+        <w:sz w:val="20"/>
+      </w:rPr>
+    </w:lvl>
+  </w:abstractNum>
+  <w:abstractNum w:abstractNumId="3" w15:restartNumberingAfterBreak="0">
     <w:nsid w:val="69DD104A"/>
     <w:multiLevelType w:val="multilevel"/>
     <w:tmpl w:val="31AE70C4"/>
@@ -2244,12 +2692,15 @@
     </w:lvl>
   </w:abstractNum>
   <w:num w:numId="1" w16cid:durableId="1283733942">
+    <w:abstractNumId w:val="3"/>
+  </w:num>
+  <w:num w:numId="2" w16cid:durableId="1760246595">
     <w:abstractNumId w:val="2"/>
   </w:num>
-  <w:num w:numId="2" w16cid:durableId="1760246595">
+  <w:num w:numId="3" w16cid:durableId="1168062593">
     <w:abstractNumId w:val="1"/>
   </w:num>
-  <w:num w:numId="3" w16cid:durableId="1168062593">
+  <w:num w:numId="4" w16cid:durableId="971449164">
     <w:abstractNumId w:val="0"/>
   </w:num>
 </w:numbering>

</xml_diff>

<commit_message>
Proje 1: Raporun sonuç kısmı tamamlandı ve proje sonlandırıldı
</commit_message>
<xml_diff>
--- a/BLM4522_Proje1/Proje1_Rapor.docx
+++ b/BLM4522_Proje1/Proje1_Rapor.docx
@@ -400,7 +400,7 @@
           <w:r>
             <w:fldChar w:fldCharType="separate"/>
           </w:r>
-          <w:hyperlink w:anchor="_Toc231229962" w:history="1">
+          <w:hyperlink w:anchor="_Toc231232076" w:history="1">
             <w:r>
               <w:rPr>
                 <w:rStyle w:val="Kpr"/>
@@ -428,7 +428,7 @@
                 <w:noProof/>
                 <w:webHidden/>
               </w:rPr>
-              <w:instrText xml:space="preserve"> PAGEREF _Toc231229962 \h </w:instrText>
+              <w:instrText xml:space="preserve"> PAGEREF _Toc231232076 \h </w:instrText>
             </w:r>
             <w:r>
               <w:rPr>
@@ -472,7 +472,7 @@
               <w14:ligatures w14:val="standardContextual"/>
             </w:rPr>
           </w:pPr>
-          <w:hyperlink w:anchor="_Toc231229963" w:history="1">
+          <w:hyperlink w:anchor="_Toc231232077" w:history="1">
             <w:r>
               <w:rPr>
                 <w:rStyle w:val="Kpr"/>
@@ -499,7 +499,7 @@
                 <w:noProof/>
                 <w:webHidden/>
               </w:rPr>
-              <w:instrText xml:space="preserve"> PAGEREF _Toc231229963 \h </w:instrText>
+              <w:instrText xml:space="preserve"> PAGEREF _Toc231232077 \h </w:instrText>
             </w:r>
             <w:r>
               <w:rPr>
@@ -543,7 +543,7 @@
               <w14:ligatures w14:val="standardContextual"/>
             </w:rPr>
           </w:pPr>
-          <w:hyperlink w:anchor="_Toc231229964" w:history="1">
+          <w:hyperlink w:anchor="_Toc231232078" w:history="1">
             <w:r>
               <w:rPr>
                 <w:rStyle w:val="Kpr"/>
@@ -570,7 +570,7 @@
                 <w:noProof/>
                 <w:webHidden/>
               </w:rPr>
-              <w:instrText xml:space="preserve"> PAGEREF _Toc231229964 \h </w:instrText>
+              <w:instrText xml:space="preserve"> PAGEREF _Toc231232078 \h </w:instrText>
             </w:r>
             <w:r>
               <w:rPr>
@@ -614,7 +614,7 @@
               <w14:ligatures w14:val="standardContextual"/>
             </w:rPr>
           </w:pPr>
-          <w:hyperlink w:anchor="_Toc231229965" w:history="1">
+          <w:hyperlink w:anchor="_Toc231232079" w:history="1">
             <w:r>
               <w:rPr>
                 <w:rStyle w:val="Kpr"/>
@@ -641,7 +641,7 @@
                 <w:noProof/>
                 <w:webHidden/>
               </w:rPr>
-              <w:instrText xml:space="preserve"> PAGEREF _Toc231229965 \h </w:instrText>
+              <w:instrText xml:space="preserve"> PAGEREF _Toc231232079 \h </w:instrText>
             </w:r>
             <w:r>
               <w:rPr>
@@ -685,7 +685,7 @@
               <w14:ligatures w14:val="standardContextual"/>
             </w:rPr>
           </w:pPr>
-          <w:hyperlink w:anchor="_Toc231229966" w:history="1">
+          <w:hyperlink w:anchor="_Toc231232080" w:history="1">
             <w:r>
               <w:rPr>
                 <w:rStyle w:val="Kpr"/>
@@ -712,7 +712,7 @@
                 <w:noProof/>
                 <w:webHidden/>
               </w:rPr>
-              <w:instrText xml:space="preserve"> PAGEREF _Toc231229966 \h </w:instrText>
+              <w:instrText xml:space="preserve"> PAGEREF _Toc231232080 \h </w:instrText>
             </w:r>
             <w:r>
               <w:rPr>
@@ -756,7 +756,7 @@
               <w14:ligatures w14:val="standardContextual"/>
             </w:rPr>
           </w:pPr>
-          <w:hyperlink w:anchor="_Toc231229967" w:history="1">
+          <w:hyperlink w:anchor="_Toc231232081" w:history="1">
             <w:r>
               <w:rPr>
                 <w:rStyle w:val="Kpr"/>
@@ -783,7 +783,7 @@
                 <w:noProof/>
                 <w:webHidden/>
               </w:rPr>
-              <w:instrText xml:space="preserve"> PAGEREF _Toc231229967 \h </w:instrText>
+              <w:instrText xml:space="preserve"> PAGEREF _Toc231232081 \h </w:instrText>
             </w:r>
             <w:r>
               <w:rPr>
@@ -827,7 +827,7 @@
               <w14:ligatures w14:val="standardContextual"/>
             </w:rPr>
           </w:pPr>
-          <w:hyperlink w:anchor="_Toc231229968" w:history="1">
+          <w:hyperlink w:anchor="_Toc231232082" w:history="1">
             <w:r>
               <w:rPr>
                 <w:rStyle w:val="Kpr"/>
@@ -854,7 +854,7 @@
                 <w:noProof/>
                 <w:webHidden/>
               </w:rPr>
-              <w:instrText xml:space="preserve"> PAGEREF _Toc231229968 \h </w:instrText>
+              <w:instrText xml:space="preserve"> PAGEREF _Toc231232082 \h </w:instrText>
             </w:r>
             <w:r>
               <w:rPr>
@@ -875,6 +875,77 @@
                 <w:webHidden/>
               </w:rPr>
               <w:t>7</w:t>
+            </w:r>
+            <w:r>
+              <w:rPr>
+                <w:noProof/>
+                <w:webHidden/>
+              </w:rPr>
+              <w:fldChar w:fldCharType="end"/>
+            </w:r>
+          </w:hyperlink>
+        </w:p>
+        <w:p>
+          <w:pPr>
+            <w:pStyle w:val="T2"/>
+            <w:rPr>
+              <w:rFonts w:asciiTheme="minorHAnsi" w:eastAsiaTheme="minorEastAsia" w:hAnsiTheme="minorHAnsi" w:cstheme="minorBidi"/>
+              <w:b w:val="0"/>
+              <w:noProof/>
+              <w:kern w:val="2"/>
+              <w:u w:val="none"/>
+              <w:lang w:eastAsia="tr-TR"/>
+              <w14:ligatures w14:val="standardContextual"/>
+            </w:rPr>
+          </w:pPr>
+          <w:hyperlink w:anchor="_Toc231232083" w:history="1">
+            <w:r>
+              <w:rPr>
+                <w:rStyle w:val="Kpr"/>
+                <w:noProof/>
+              </w:rPr>
+              <w:t>Adım 7: Sonuç</w:t>
+            </w:r>
+            <w:r>
+              <w:rPr>
+                <w:noProof/>
+                <w:webHidden/>
+              </w:rPr>
+              <w:tab/>
+            </w:r>
+            <w:r>
+              <w:rPr>
+                <w:noProof/>
+                <w:webHidden/>
+              </w:rPr>
+              <w:fldChar w:fldCharType="begin"/>
+            </w:r>
+            <w:r>
+              <w:rPr>
+                <w:noProof/>
+                <w:webHidden/>
+              </w:rPr>
+              <w:instrText xml:space="preserve"> PAGEREF _Toc231232083 \h </w:instrText>
+            </w:r>
+            <w:r>
+              <w:rPr>
+                <w:noProof/>
+                <w:webHidden/>
+              </w:rPr>
+            </w:r>
+            <w:r>
+              <w:rPr>
+                <w:noProof/>
+                <w:webHidden/>
+              </w:rPr>
+              <w:fldChar w:fldCharType="separate"/>
+            </w:r>
+            <w:r>
+              <w:rPr>
+                <w:noProof/>
+                <w:webHidden/>
+              </w:rPr>
+              <w:t>8</w:t>
             </w:r>
             <w:r>
               <w:rPr>
@@ -928,7 +999,7 @@
           <w:color w:val="000000" w:themeColor="text1"/>
         </w:rPr>
       </w:pPr>
-      <w:bookmarkStart w:id="0" w:name="_Toc231229962"/>
+      <w:bookmarkStart w:id="0" w:name="_Toc231232076"/>
       <w:r>
         <w:rPr>
           <w:b/>
@@ -982,7 +1053,7 @@
       <w:pPr>
         <w:pStyle w:val="Balk2"/>
       </w:pPr>
-      <w:bookmarkStart w:id="1" w:name="_Toc231229963"/>
+      <w:bookmarkStart w:id="1" w:name="_Toc231232077"/>
       <w:r>
         <w:t xml:space="preserve">ADIM 1: </w:t>
       </w:r>
@@ -1268,7 +1339,7 @@
       <w:pPr>
         <w:pStyle w:val="Balk2"/>
       </w:pPr>
-      <w:bookmarkStart w:id="2" w:name="_Toc231229964"/>
+      <w:bookmarkStart w:id="2" w:name="_Toc231232078"/>
       <w:r>
         <w:t xml:space="preserve">ADIM </w:t>
       </w:r>
@@ -1517,7 +1588,7 @@
       <w:pPr>
         <w:pStyle w:val="Balk2"/>
       </w:pPr>
-      <w:bookmarkStart w:id="3" w:name="_Toc231229965"/>
+      <w:bookmarkStart w:id="3" w:name="_Toc231232079"/>
       <w:r>
         <w:t>ADIM 3: İndeks Yapılandırması ve Performans Optimizasyonu</w:t>
       </w:r>
@@ -1736,7 +1807,7 @@
       <w:pPr>
         <w:pStyle w:val="Balk2"/>
       </w:pPr>
-      <w:bookmarkStart w:id="4" w:name="_Toc231229966"/>
+      <w:bookmarkStart w:id="4" w:name="_Toc231232080"/>
       <w:r>
         <w:t xml:space="preserve">ADIM 4: </w:t>
       </w:r>
@@ -1920,7 +1991,7 @@
       <w:pPr>
         <w:pStyle w:val="Balk2"/>
       </w:pPr>
-      <w:bookmarkStart w:id="5" w:name="_Toc231229967"/>
+      <w:bookmarkStart w:id="5" w:name="_Toc231232081"/>
       <w:r>
         <w:t>ADIM 5: Veri Yöneticisi Rolleri ve Erişim Yönetimi</w:t>
       </w:r>
@@ -1994,7 +2065,7 @@
       <w:pPr>
         <w:pStyle w:val="Balk2"/>
       </w:pPr>
-      <w:bookmarkStart w:id="6" w:name="_Toc231229968"/>
+      <w:bookmarkStart w:id="6" w:name="_Toc231232082"/>
       <w:r>
         <w:t>ADIM 6: Disk Alanı Yönetimi ve Takibi</w:t>
       </w:r>
@@ -2003,6 +2074,9 @@
     <w:p/>
     <w:p>
       <w:r>
+        <w:rPr>
+          <w:noProof/>
+        </w:rPr>
         <w:drawing>
           <wp:inline distT="0" distB="0" distL="0" distR="0" wp14:anchorId="5E2A1A25" wp14:editId="193DB1B7">
             <wp:extent cx="4861981" cy="807790"/>
@@ -2117,7 +2191,234 @@
         <w:t xml:space="preserve"> disk üzerinde kapladığı alan, veri yoğunluğu ve sistemde kalan boş yer miktarı dinamik olarak takip edilmektedir.</w:t>
       </w:r>
     </w:p>
-    <w:p/>
+    <w:p>
+      <w:r>
+        <w:lastRenderedPageBreak/>
+        <w:t>01.06.2026</w:t>
+      </w:r>
+    </w:p>
+    <w:p>
+      <w:pPr>
+        <w:pStyle w:val="Balk2"/>
+      </w:pPr>
+      <w:bookmarkStart w:id="7" w:name="_Toc231232083"/>
+      <w:r>
+        <w:t>Adım 7: Sonuç</w:t>
+      </w:r>
+      <w:bookmarkEnd w:id="7"/>
+    </w:p>
+    <w:p>
+      <w:r>
+        <w:t xml:space="preserve">Bu proje kapsamında, AdventureWorks2019 ilişkisel </w:t>
+      </w:r>
+      <w:proofErr w:type="spellStart"/>
+      <w:r>
+        <w:t>veritabanı</w:t>
+      </w:r>
+      <w:proofErr w:type="spellEnd"/>
+      <w:r>
+        <w:t xml:space="preserve"> üzerinde performans optimizasyonu, sistem izleme ve erişim yönetimi süreçleri uygulamalı olarak gerçekleştirilmiştir. Proje boyunca elde edilen kazanımlar ve yapısal optimizasyonlar şu şekilde özetlenmektedir:</w:t>
+      </w:r>
+    </w:p>
+    <w:p>
+      <w:pPr>
+        <w:numPr>
+          <w:ilvl w:val="0"/>
+          <w:numId w:val="5"/>
+        </w:numPr>
+      </w:pPr>
+      <w:r>
+        <w:t xml:space="preserve">Performans İyileştirmesi: </w:t>
+      </w:r>
+      <w:proofErr w:type="spellStart"/>
+      <w:r>
+        <w:t>Veritabanı</w:t>
+      </w:r>
+      <w:proofErr w:type="spellEnd"/>
+      <w:r>
+        <w:t xml:space="preserve"> üzerinde indeks barındırmayan kolonlara yönelik çalıştırılan ağır sorguların sistemde ciddi bir maliyet (darboğaz) oluşturduğu </w:t>
+      </w:r>
+      <w:proofErr w:type="spellStart"/>
+      <w:r>
+        <w:rPr>
+          <w:i/>
+          <w:iCs/>
+        </w:rPr>
+        <w:t>Actual</w:t>
+      </w:r>
+      <w:proofErr w:type="spellEnd"/>
+      <w:r>
+        <w:rPr>
+          <w:i/>
+          <w:iCs/>
+        </w:rPr>
+        <w:t xml:space="preserve"> </w:t>
+      </w:r>
+      <w:proofErr w:type="spellStart"/>
+      <w:r>
+        <w:rPr>
+          <w:i/>
+          <w:iCs/>
+        </w:rPr>
+        <w:t>Execution</w:t>
+      </w:r>
+      <w:proofErr w:type="spellEnd"/>
+      <w:r>
+        <w:rPr>
+          <w:i/>
+          <w:iCs/>
+        </w:rPr>
+        <w:t xml:space="preserve"> Plan</w:t>
+      </w:r>
+      <w:r>
+        <w:t xml:space="preserve"> üzerinde gözlemlenmiştir. SQL Server'ın önerisi doğrultusunda sisteme dahil edilen </w:t>
+      </w:r>
+      <w:proofErr w:type="spellStart"/>
+      <w:r>
+        <w:rPr>
+          <w:i/>
+          <w:iCs/>
+        </w:rPr>
+        <w:t>Non-Clustered</w:t>
+      </w:r>
+      <w:proofErr w:type="spellEnd"/>
+      <w:r>
+        <w:rPr>
+          <w:i/>
+          <w:iCs/>
+        </w:rPr>
+        <w:t xml:space="preserve"> Index</w:t>
+      </w:r>
+      <w:r>
+        <w:t xml:space="preserve"> yapısı sayesinde, verimsiz tablo tarama (</w:t>
+      </w:r>
+      <w:proofErr w:type="spellStart"/>
+      <w:r>
+        <w:rPr>
+          <w:i/>
+          <w:iCs/>
+        </w:rPr>
+        <w:t>Scan</w:t>
+      </w:r>
+      <w:proofErr w:type="spellEnd"/>
+      <w:r>
+        <w:t>) işlemleri nokta atışı arama (</w:t>
+      </w:r>
+      <w:proofErr w:type="spellStart"/>
+      <w:r>
+        <w:rPr>
+          <w:i/>
+          <w:iCs/>
+        </w:rPr>
+        <w:t>Seek</w:t>
+      </w:r>
+      <w:proofErr w:type="spellEnd"/>
+      <w:r>
+        <w:t>) operasyonlarına dönüştürülmüştür. Böylece sistem kaynaklarının gereksiz kullanımı engellenmiş ve sorgu performansında radikal bir artış sağlanmıştır.</w:t>
+      </w:r>
+    </w:p>
+    <w:p>
+      <w:pPr>
+        <w:numPr>
+          <w:ilvl w:val="0"/>
+          <w:numId w:val="5"/>
+        </w:numPr>
+      </w:pPr>
+      <w:r>
+        <w:t xml:space="preserve">Sistem İzleme ve Yönetim: </w:t>
+      </w:r>
+      <w:proofErr w:type="spellStart"/>
+      <w:r>
+        <w:rPr>
+          <w:i/>
+          <w:iCs/>
+        </w:rPr>
+        <w:t>Dynamic</w:t>
+      </w:r>
+      <w:proofErr w:type="spellEnd"/>
+      <w:r>
+        <w:rPr>
+          <w:i/>
+          <w:iCs/>
+        </w:rPr>
+        <w:t xml:space="preserve"> Management </w:t>
+      </w:r>
+      <w:proofErr w:type="spellStart"/>
+      <w:r>
+        <w:rPr>
+          <w:i/>
+          <w:iCs/>
+        </w:rPr>
+        <w:t>Views</w:t>
+      </w:r>
+      <w:proofErr w:type="spellEnd"/>
+      <w:r>
+        <w:rPr>
+          <w:i/>
+          <w:iCs/>
+        </w:rPr>
+        <w:t xml:space="preserve"> (DMV)</w:t>
+      </w:r>
+      <w:r>
+        <w:t xml:space="preserve"> sorguları kullanılarak sistemde en çok işlemci (CPU) tüketen dinamik sorgular canlı olarak izlenmiş ve raporlanmıştır. Buna ek olarak yapılan disk alanı analiziyle, </w:t>
+      </w:r>
+      <w:proofErr w:type="spellStart"/>
+      <w:r>
+        <w:t>veritabanı</w:t>
+      </w:r>
+      <w:proofErr w:type="spellEnd"/>
+      <w:r>
+        <w:t xml:space="preserve"> veri ve log dosyalarının boyutları ile doluluk oranları dinamik olarak kontrol edilmiştir.</w:t>
+      </w:r>
+    </w:p>
+    <w:p>
+      <w:pPr>
+        <w:numPr>
+          <w:ilvl w:val="0"/>
+          <w:numId w:val="5"/>
+        </w:numPr>
+      </w:pPr>
+      <w:r>
+        <w:t xml:space="preserve">Erişim Güvenliği: Veri güvenliği ve kısıtlı rol yönetimi kapsamında oluşturulan </w:t>
+      </w:r>
+      <w:proofErr w:type="spellStart"/>
+      <w:r>
+        <w:t>DenetleyiciUser</w:t>
+      </w:r>
+      <w:proofErr w:type="spellEnd"/>
+      <w:r>
+        <w:t xml:space="preserve"> kullanıcısına yalnızca </w:t>
+      </w:r>
+      <w:proofErr w:type="spellStart"/>
+      <w:r>
+        <w:t>db_datareader</w:t>
+      </w:r>
+      <w:proofErr w:type="spellEnd"/>
+      <w:r>
+        <w:t xml:space="preserve"> yetkisi atanmıştır. Bu sayede </w:t>
+      </w:r>
+      <w:proofErr w:type="spellStart"/>
+      <w:r>
+        <w:t>veritabanı</w:t>
+      </w:r>
+      <w:proofErr w:type="spellEnd"/>
+      <w:r>
+        <w:t xml:space="preserve"> üzerinde veri değiştirme yetkisi bulunmayan, sadece performans denetimi yapabilecek güvenli bir kullanıcı mimarisi devreye alınmıştır.</w:t>
+      </w:r>
+    </w:p>
+    <w:p>
+      <w:r>
+        <w:t xml:space="preserve">Sonuç olarak, büyük veri kümelerinde doğru indeksleme stratejilerinin ve proaktif izleme araçlarının kullanımıyla, donanım yükseltmesine gerek kalmaksızın yazılımsal optimizasyonlarla </w:t>
+      </w:r>
+      <w:proofErr w:type="spellStart"/>
+      <w:r>
+        <w:t>veritabanı</w:t>
+      </w:r>
+      <w:proofErr w:type="spellEnd"/>
+      <w:r>
+        <w:t xml:space="preserve"> sistemlerinin ne ölçüde verimli hale getirilebileceği başarıyla ortaya konulmuştur.</w:t>
+      </w:r>
+    </w:p>
     <w:p/>
     <w:sectPr>
       <w:pgSz w:w="11906" w:h="16838"/>
@@ -2691,6 +2992,155 @@
       </w:pPr>
     </w:lvl>
   </w:abstractNum>
+  <w:abstractNum w:abstractNumId="4" w15:restartNumberingAfterBreak="0">
+    <w:nsid w:val="7F8F52FE"/>
+    <w:multiLevelType w:val="multilevel"/>
+    <w:tmpl w:val="37F650B4"/>
+    <w:lvl w:ilvl="0">
+      <w:start w:val="1"/>
+      <w:numFmt w:val="bullet"/>
+      <w:lvlText w:val=""/>
+      <w:lvlJc w:val="left"/>
+      <w:pPr>
+        <w:tabs>
+          <w:tab w:val="num" w:pos="720"/>
+        </w:tabs>
+        <w:ind w:left="720" w:hanging="360"/>
+      </w:pPr>
+      <w:rPr>
+        <w:rFonts w:ascii="Symbol" w:hAnsi="Symbol" w:hint="default"/>
+        <w:sz w:val="20"/>
+      </w:rPr>
+    </w:lvl>
+    <w:lvl w:ilvl="1" w:tentative="1">
+      <w:start w:val="1"/>
+      <w:numFmt w:val="bullet"/>
+      <w:lvlText w:val="o"/>
+      <w:lvlJc w:val="left"/>
+      <w:pPr>
+        <w:tabs>
+          <w:tab w:val="num" w:pos="1440"/>
+        </w:tabs>
+        <w:ind w:left="1440" w:hanging="360"/>
+      </w:pPr>
+      <w:rPr>
+        <w:rFonts w:ascii="Courier New" w:hAnsi="Courier New" w:hint="default"/>
+        <w:sz w:val="20"/>
+      </w:rPr>
+    </w:lvl>
+    <w:lvl w:ilvl="2" w:tentative="1">
+      <w:start w:val="1"/>
+      <w:numFmt w:val="bullet"/>
+      <w:lvlText w:val=""/>
+      <w:lvlJc w:val="left"/>
+      <w:pPr>
+        <w:tabs>
+          <w:tab w:val="num" w:pos="2160"/>
+        </w:tabs>
+        <w:ind w:left="2160" w:hanging="360"/>
+      </w:pPr>
+      <w:rPr>
+        <w:rFonts w:ascii="Wingdings" w:hAnsi="Wingdings" w:hint="default"/>
+        <w:sz w:val="20"/>
+      </w:rPr>
+    </w:lvl>
+    <w:lvl w:ilvl="3" w:tentative="1">
+      <w:start w:val="1"/>
+      <w:numFmt w:val="bullet"/>
+      <w:lvlText w:val=""/>
+      <w:lvlJc w:val="left"/>
+      <w:pPr>
+        <w:tabs>
+          <w:tab w:val="num" w:pos="2880"/>
+        </w:tabs>
+        <w:ind w:left="2880" w:hanging="360"/>
+      </w:pPr>
+      <w:rPr>
+        <w:rFonts w:ascii="Wingdings" w:hAnsi="Wingdings" w:hint="default"/>
+        <w:sz w:val="20"/>
+      </w:rPr>
+    </w:lvl>
+    <w:lvl w:ilvl="4" w:tentative="1">
+      <w:start w:val="1"/>
+      <w:numFmt w:val="bullet"/>
+      <w:lvlText w:val=""/>
+      <w:lvlJc w:val="left"/>
+      <w:pPr>
+        <w:tabs>
+          <w:tab w:val="num" w:pos="3600"/>
+        </w:tabs>
+        <w:ind w:left="3600" w:hanging="360"/>
+      </w:pPr>
+      <w:rPr>
+        <w:rFonts w:ascii="Wingdings" w:hAnsi="Wingdings" w:hint="default"/>
+        <w:sz w:val="20"/>
+      </w:rPr>
+    </w:lvl>
+    <w:lvl w:ilvl="5" w:tentative="1">
+      <w:start w:val="1"/>
+      <w:numFmt w:val="bullet"/>
+      <w:lvlText w:val=""/>
+      <w:lvlJc w:val="left"/>
+      <w:pPr>
+        <w:tabs>
+          <w:tab w:val="num" w:pos="4320"/>
+        </w:tabs>
+        <w:ind w:left="4320" w:hanging="360"/>
+      </w:pPr>
+      <w:rPr>
+        <w:rFonts w:ascii="Wingdings" w:hAnsi="Wingdings" w:hint="default"/>
+        <w:sz w:val="20"/>
+      </w:rPr>
+    </w:lvl>
+    <w:lvl w:ilvl="6" w:tentative="1">
+      <w:start w:val="1"/>
+      <w:numFmt w:val="bullet"/>
+      <w:lvlText w:val=""/>
+      <w:lvlJc w:val="left"/>
+      <w:pPr>
+        <w:tabs>
+          <w:tab w:val="num" w:pos="5040"/>
+        </w:tabs>
+        <w:ind w:left="5040" w:hanging="360"/>
+      </w:pPr>
+      <w:rPr>
+        <w:rFonts w:ascii="Wingdings" w:hAnsi="Wingdings" w:hint="default"/>
+        <w:sz w:val="20"/>
+      </w:rPr>
+    </w:lvl>
+    <w:lvl w:ilvl="7" w:tentative="1">
+      <w:start w:val="1"/>
+      <w:numFmt w:val="bullet"/>
+      <w:lvlText w:val=""/>
+      <w:lvlJc w:val="left"/>
+      <w:pPr>
+        <w:tabs>
+          <w:tab w:val="num" w:pos="5760"/>
+        </w:tabs>
+        <w:ind w:left="5760" w:hanging="360"/>
+      </w:pPr>
+      <w:rPr>
+        <w:rFonts w:ascii="Wingdings" w:hAnsi="Wingdings" w:hint="default"/>
+        <w:sz w:val="20"/>
+      </w:rPr>
+    </w:lvl>
+    <w:lvl w:ilvl="8" w:tentative="1">
+      <w:start w:val="1"/>
+      <w:numFmt w:val="bullet"/>
+      <w:lvlText w:val=""/>
+      <w:lvlJc w:val="left"/>
+      <w:pPr>
+        <w:tabs>
+          <w:tab w:val="num" w:pos="6480"/>
+        </w:tabs>
+        <w:ind w:left="6480" w:hanging="360"/>
+      </w:pPr>
+      <w:rPr>
+        <w:rFonts w:ascii="Wingdings" w:hAnsi="Wingdings" w:hint="default"/>
+        <w:sz w:val="20"/>
+      </w:rPr>
+    </w:lvl>
+  </w:abstractNum>
   <w:num w:numId="1" w16cid:durableId="1283733942">
     <w:abstractNumId w:val="3"/>
   </w:num>
@@ -2702,6 +3152,9 @@
   </w:num>
   <w:num w:numId="4" w16cid:durableId="971449164">
     <w:abstractNumId w:val="0"/>
+  </w:num>
+  <w:num w:numId="5" w16cid:durableId="965817460">
+    <w:abstractNumId w:val="4"/>
   </w:num>
 </w:numbering>
 </file>

</xml_diff>